<commit_message>
Publish 20-page illustrated guide and mobile readers v3.0.0
</commit_message>
<xml_diff>
--- a/downloads/hermes-wechat-guide.docx
+++ b/downloads/hermes-wechat-guide.docx
@@ -10,7 +10,7 @@
         <w:rPr>
           <w:rFonts w:eastAsia="Arial Unicode MS" w:ascii="Arial Unicode MS" w:hAnsi="Arial Unicode MS"/>
         </w:rPr>
-        <w:t>用 Hermes Agent 下载研究文献 从安装到批量归档的图文教程</w:t>
+        <w:t>用 Hermes Agent 下载研究文献：从第一篇 PDF 到文献库</w:t>
       </w:r>
     </w:p>
     <w:p>
@@ -63,16 +63,7 @@
         <w:rPr>
           <w:rFonts w:eastAsia="Arial Unicode MS" w:ascii="Arial Unicode MS" w:hAnsi="Arial Unicode MS"/>
         </w:rPr>
-        <w:t>找到了论文题名，接下来往往还有一串工作：核对是不是要找的那篇，打开全文入口，保存 PDF，改文件名，再把来源和版本记下来。</w:t>
-      </w:r>
-    </w:p>
-    <w:p>
-      <w:pPr/>
-      <w:r>
-        <w:rPr>
-          <w:rFonts w:eastAsia="Arial Unicode MS" w:ascii="Arial Unicode MS" w:hAnsi="Arial Unicode MS"/>
-        </w:rPr>
-        <w:t>几篇论文可以手动整理；几十篇论文一起处理时，最容易出问题的往往是最后几步。下载文件夹里多了几个 PDF，却说不清它们对应哪条文献、从哪里取得、是不是正式发表版。</w:t>
+        <w:t>找到了论文题名，接下来还有核对身份、寻找全文、保存文件、记录来源等工作。几篇可以手动整理；数量多了，容易出现“下载了文件，却不知道对应哪条文献”的问题。</w:t>
       </w:r>
     </w:p>
     <w:p>
@@ -82,7 +73,13 @@
           <w:rFonts w:eastAsia="Arial Unicode MS" w:ascii="Arial Unicode MS" w:hAnsi="Arial Unicode MS"/>
           <w:b/>
         </w:rPr>
-        <w:t>Hermes Agent 可以把检索、获取、核验和归档连接起来。使用时，把任务和验收标准一起交给它，结果会更容易检查。</w:t>
+        <w:t>Hermes Agent 可以把检索、保存、核验和归档连接起来。任务里同时写明操作要求和完成标准，结果才容易检查。</w:t>
+      </w:r>
+      <w:r>
+        <w:rPr>
+          <w:rFonts w:eastAsia="Arial Unicode MS" w:ascii="Arial Unicode MS" w:hAnsi="Arial Unicode MS"/>
+        </w:rPr>
+        <w:t xml:space="preserve"> 本文从打开终端开始，先练习一篇公开论文，再处理医学文献和批量清单。命令从正文复制；以“请……”开头的任务，发到启动后的 Hermes 对话中。</w:t>
       </w:r>
     </w:p>
     <w:p>
@@ -91,7 +88,20 @@
         <w:rPr>
           <w:rFonts w:eastAsia="Arial Unicode MS" w:ascii="Arial Unicode MS" w:hAnsi="Arial Unicode MS"/>
         </w:rPr>
-        <w:t>这篇教程以 Nous Research 的 Hermes Agent 为例，先完成一篇公开论文的下载，再练习医学文献和清单处理。每一步都写明在哪里输入、具体怎么做、完成后检查什么。正文提示词可以整段复制。</w:t>
+        <w:t>跟做顺序：</w:t>
+      </w:r>
+      <w:r>
+        <w:rPr>
+          <w:rFonts w:eastAsia="Arial Unicode MS" w:ascii="Arial Unicode MS" w:hAnsi="Arial Unicode MS"/>
+          <w:b/>
+        </w:rPr>
+        <w:t>安装 → 配置 → 环境检查 → 单篇下载 → 清单处理 → 核验归档。</w:t>
+      </w:r>
+      <w:r>
+        <w:rPr>
+          <w:rFonts w:eastAsia="Arial Unicode MS" w:ascii="Arial Unicode MS" w:hAnsi="Arial Unicode MS"/>
+        </w:rPr>
+        <w:t xml:space="preserve"> 新手按第 02 至 06 节完成第一轮；已装好 Hermes，先做第 05 节检查。配套手机版与本稿正文一致，支持分节跳转、复制任务和放大图片。</w:t>
       </w:r>
     </w:p>
     <w:p>
@@ -102,7 +112,7 @@
         <w:rPr>
           <w:rFonts w:eastAsia="Arial Unicode MS" w:ascii="Arial Unicode MS" w:hAnsi="Arial Unicode MS"/>
         </w:rPr>
-        <w:t>适用范围：本机命令行入门；已使用桌面端的读者也可参考任务提示词。官方文档核对日期为 2026 年 10 月 2 日。本文提示词是任务模板，不是新增的 Hermes 命令。</w:t>
+        <w:t>适用范围：Nous Research 的 Hermes Agent，本机命令行入门。官方文档核对日期：2026 年 10 月 2 日。操作图为指引；真实页面截图另有标注。</w:t>
       </w:r>
     </w:p>
     <w:p>
@@ -113,7 +123,7 @@
         <w:rPr>
           <w:rFonts w:eastAsia="Arial Unicode MS" w:ascii="Arial Unicode MS" w:hAnsi="Arial Unicode MS"/>
         </w:rPr>
-        <w:t>01 先认识 Hermes 和文献下载这件事</w:t>
+        <w:t>01 先确认你要找的是哪篇论文</w:t>
       </w:r>
     </w:p>
     <w:p>
@@ -122,14 +132,14 @@
         <w:rPr>
           <w:rFonts w:eastAsia="Arial Unicode MS" w:ascii="Arial Unicode MS" w:hAnsi="Arial Unicode MS"/>
         </w:rPr>
-        <w:t>Hermes Agent 是一个可以调用工具执行任务的 AI 助手。模型负责理解任务；网页工具负责找资料；终端和文件工具负责执行下载、保存和整理。本文的文献流程，是将这些能力组合起来使用。</w:t>
+        <w:t>Hermes 的模型负责理解任务，网页工具负责找资料，终端和文件工具负责实际保存。本文将这些能力组合成文献流程，并非新增的“论文下载”内置命令。</w:t>
       </w:r>
       <w:hyperlink r:id="rId10">
         <w:r>
           <w:rPr>
             <w:color w:val="197B82"/>
           </w:rPr>
-          <w:t>Hermes 官方工具说明</w:t>
+          <w:t>官方工具说明</w:t>
         </w:r>
       </w:hyperlink>
     </w:p>
@@ -139,219 +149,14 @@
         <w:rPr>
           <w:rFonts w:eastAsia="Arial Unicode MS" w:ascii="Arial Unicode MS" w:hAnsi="Arial Unicode MS"/>
         </w:rPr>
-        <w:t>可以把一次文献获取任务分成四步：</w:t>
-      </w:r>
-    </w:p>
-    <w:p>
-      <w:pPr>
-        <w:ind w:left="173"/>
-      </w:pPr>
-      <w:r>
-        <w:rPr>
-          <w:rFonts w:eastAsia="Arial Unicode MS" w:ascii="Arial Unicode MS" w:hAnsi="Arial Unicode MS"/>
-        </w:rPr>
-        <w:t xml:space="preserve">1. </w:t>
+        <w:t>准确编号比宽泛主题更容易核对：DOI 标识学术作品；PMID 是 PubMed 题录编号；PMCID 是 PMC 全文记录编号；arXiv 编号还可以带版本后缀。</w:t>
       </w:r>
       <w:r>
         <w:rPr>
           <w:rFonts w:eastAsia="Arial Unicode MS" w:ascii="Arial Unicode MS" w:hAnsi="Arial Unicode MS"/>
           <w:b/>
         </w:rPr>
-        <w:t>确认身份</w:t>
-      </w:r>
-      <w:r>
-        <w:rPr>
-          <w:rFonts w:eastAsia="Arial Unicode MS" w:ascii="Arial Unicode MS" w:hAnsi="Arial Unicode MS"/>
-        </w:rPr>
-        <w:t>：用题名、作者、年份和标识符确认论文。</w:t>
-      </w:r>
-    </w:p>
-    <w:p>
-      <w:pPr>
-        <w:ind w:left="173"/>
-      </w:pPr>
-      <w:r>
-        <w:rPr>
-          <w:rFonts w:eastAsia="Arial Unicode MS" w:ascii="Arial Unicode MS" w:hAnsi="Arial Unicode MS"/>
-        </w:rPr>
-        <w:t xml:space="preserve">2. </w:t>
-      </w:r>
-      <w:r>
-        <w:rPr>
-          <w:rFonts w:eastAsia="Arial Unicode MS" w:ascii="Arial Unicode MS" w:hAnsi="Arial Unicode MS"/>
-          <w:b/>
-        </w:rPr>
-        <w:t>寻找全文</w:t>
-      </w:r>
-      <w:r>
-        <w:rPr>
-          <w:rFonts w:eastAsia="Arial Unicode MS" w:ascii="Arial Unicode MS" w:hAnsi="Arial Unicode MS"/>
-        </w:rPr>
-        <w:t>：查期刊官网、公开仓储或机构订阅入口。</w:t>
-      </w:r>
-    </w:p>
-    <w:p>
-      <w:pPr>
-        <w:ind w:left="173"/>
-      </w:pPr>
-      <w:r>
-        <w:rPr>
-          <w:rFonts w:eastAsia="Arial Unicode MS" w:ascii="Arial Unicode MS" w:hAnsi="Arial Unicode MS"/>
-        </w:rPr>
-        <w:t xml:space="preserve">3. </w:t>
-      </w:r>
-      <w:r>
-        <w:rPr>
-          <w:rFonts w:eastAsia="Arial Unicode MS" w:ascii="Arial Unicode MS" w:hAnsi="Arial Unicode MS"/>
-          <w:b/>
-        </w:rPr>
-        <w:t>保存文件</w:t>
-      </w:r>
-      <w:r>
-        <w:rPr>
-          <w:rFonts w:eastAsia="Arial Unicode MS" w:ascii="Arial Unicode MS" w:hAnsi="Arial Unicode MS"/>
-        </w:rPr>
-        <w:t>：把真实全文写入指定文件夹。</w:t>
-      </w:r>
-    </w:p>
-    <w:p>
-      <w:pPr>
-        <w:ind w:left="173"/>
-      </w:pPr>
-      <w:r>
-        <w:rPr>
-          <w:rFonts w:eastAsia="Arial Unicode MS" w:ascii="Arial Unicode MS" w:hAnsi="Arial Unicode MS"/>
-        </w:rPr>
-        <w:t xml:space="preserve">4. </w:t>
-      </w:r>
-      <w:r>
-        <w:rPr>
-          <w:rFonts w:eastAsia="Arial Unicode MS" w:ascii="Arial Unicode MS" w:hAnsi="Arial Unicode MS"/>
-          <w:b/>
-        </w:rPr>
-        <w:t>核验归档</w:t>
-      </w:r>
-      <w:r>
-        <w:rPr>
-          <w:rFonts w:eastAsia="Arial Unicode MS" w:ascii="Arial Unicode MS" w:hAnsi="Arial Unicode MS"/>
-        </w:rPr>
-        <w:t>：检查内容与版本，并记录来源和处理状态。</w:t>
-      </w:r>
-    </w:p>
-    <w:p>
-      <w:pPr/>
-      <w:r>
-        <w:rPr>
-          <w:rFonts w:eastAsia="Arial Unicode MS" w:ascii="Arial Unicode MS" w:hAnsi="Arial Unicode MS"/>
-        </w:rPr>
-        <w:t>下载结束后，应当拿到全文文件和一份清单；未取得全文的文献，也应保留原因。这样下一次只需要补齐未完成项。</w:t>
-      </w:r>
-    </w:p>
-    <w:p>
-      <w:pPr/>
-      <w:r>
-        <w:rPr>
-          <w:rFonts w:eastAsia="Arial Unicode MS" w:ascii="Arial Unicode MS" w:hAnsi="Arial Unicode MS"/>
-        </w:rPr>
-        <w:t>几个常见标识符先分清：</w:t>
-      </w:r>
-      <w:r>
-        <w:rPr>
-          <w:rFonts w:eastAsia="Arial Unicode MS" w:ascii="Arial Unicode MS" w:hAnsi="Arial Unicode MS"/>
-          <w:b/>
-        </w:rPr>
-        <w:t>DOI</w:t>
-      </w:r>
-      <w:r>
-        <w:rPr>
-          <w:rFonts w:eastAsia="Arial Unicode MS" w:ascii="Arial Unicode MS" w:hAnsi="Arial Unicode MS"/>
-        </w:rPr>
-        <w:t xml:space="preserve"> 用来标识学术作品；</w:t>
-      </w:r>
-      <w:r>
-        <w:rPr>
-          <w:rFonts w:eastAsia="Arial Unicode MS" w:ascii="Arial Unicode MS" w:hAnsi="Arial Unicode MS"/>
-          <w:b/>
-        </w:rPr>
-        <w:t>PMID</w:t>
-      </w:r>
-      <w:r>
-        <w:rPr>
-          <w:rFonts w:eastAsia="Arial Unicode MS" w:ascii="Arial Unicode MS" w:hAnsi="Arial Unicode MS"/>
-        </w:rPr>
-        <w:t xml:space="preserve"> 是 PubMed 的记录编号；</w:t>
-      </w:r>
-      <w:r>
-        <w:rPr>
-          <w:rFonts w:eastAsia="Arial Unicode MS" w:ascii="Arial Unicode MS" w:hAnsi="Arial Unicode MS"/>
-          <w:b/>
-        </w:rPr>
-        <w:t>PMCID</w:t>
-      </w:r>
-      <w:r>
-        <w:rPr>
-          <w:rFonts w:eastAsia="Arial Unicode MS" w:ascii="Arial Unicode MS" w:hAnsi="Arial Unicode MS"/>
-        </w:rPr>
-        <w:t xml:space="preserve"> 是 PMC 的全文记录编号；</w:t>
-      </w:r>
-      <w:r>
-        <w:rPr>
-          <w:rFonts w:eastAsia="Arial Unicode MS" w:ascii="Arial Unicode MS" w:hAnsi="Arial Unicode MS"/>
-          <w:b/>
-        </w:rPr>
-        <w:t>arXiv 编号</w:t>
-      </w:r>
-      <w:r>
-        <w:rPr>
-          <w:rFonts w:eastAsia="Arial Unicode MS" w:ascii="Arial Unicode MS" w:hAnsi="Arial Unicode MS"/>
-        </w:rPr>
-        <w:t>标识 arXiv 记录，并可带有 v1、v2 等版本号。它们有助于定位文章，但有编号并不意味着一定有可下载的 PDF。</w:t>
-      </w:r>
-    </w:p>
-    <w:p>
-      <w:pPr>
-        <w:pStyle w:val="Heading1"/>
-      </w:pPr>
-      <w:r>
-        <w:rPr>
-          <w:rFonts w:eastAsia="Arial Unicode MS" w:ascii="Arial Unicode MS" w:hAnsi="Arial Unicode MS"/>
-        </w:rPr>
-        <w:t>02 跟着操作时 先分清两个输入位置</w:t>
-      </w:r>
-    </w:p>
-    <w:p>
-      <w:pPr/>
-      <w:r>
-        <w:rPr>
-          <w:rFonts w:eastAsia="Arial Unicode MS" w:ascii="Arial Unicode MS" w:hAnsi="Arial Unicode MS"/>
-        </w:rPr>
-        <w:t>本文会交替使用两个地方：</w:t>
-      </w:r>
-      <w:r>
-        <w:rPr>
-          <w:rFonts w:eastAsia="Arial Unicode MS" w:ascii="Arial Unicode MS" w:hAnsi="Arial Unicode MS"/>
-          <w:b/>
-        </w:rPr>
-        <w:t>电脑终端</w:t>
-      </w:r>
-      <w:r>
-        <w:rPr>
-          <w:rFonts w:eastAsia="Arial Unicode MS" w:ascii="Arial Unicode MS" w:hAnsi="Arial Unicode MS"/>
-        </w:rPr>
-        <w:t>和</w:t>
-      </w:r>
-      <w:r>
-        <w:rPr>
-          <w:rFonts w:eastAsia="Arial Unicode MS" w:ascii="Arial Unicode MS" w:hAnsi="Arial Unicode MS"/>
-          <w:b/>
-        </w:rPr>
-        <w:t>Hermes 对话输入区</w:t>
-      </w:r>
-      <w:r>
-        <w:rPr>
-          <w:rFonts w:eastAsia="Arial Unicode MS" w:ascii="Arial Unicode MS" w:hAnsi="Arial Unicode MS"/>
-        </w:rPr>
-        <w:t>。这是新手最容易混淆的一步。</w:t>
+        <w:t>有编号，不等于有可下载的 PDF。</w:t>
       </w:r>
     </w:p>
     <w:p>
@@ -366,8 +171,8 @@
         </w:rPr>
         <w:drawing>
           <wp:inline xmlns:a="http://schemas.openxmlformats.org/drawingml/2006/main" xmlns:pic="http://schemas.openxmlformats.org/drawingml/2006/picture">
-            <wp:extent cx="3701142" cy="4663439"/>
-            <wp:docPr id="2" name="Picture 2" descr="图1 电脑终端和 Hermes 对话输入区的使用区别"/>
+            <wp:extent cx="2536936" cy="4206240"/>
+            <wp:docPr id="2" name="Picture 2" descr="图1 文献标识符对照"/>
             <wp:cNvGraphicFramePr>
               <a:graphicFrameLocks noChangeAspect="1"/>
             </wp:cNvGraphicFramePr>
@@ -375,7 +180,7 @@
               <a:graphicData uri="http://schemas.openxmlformats.org/drawingml/2006/picture">
                 <pic:pic>
                   <pic:nvPicPr>
-                    <pic:cNvPr id="0" name="01-inputs.png"/>
+                    <pic:cNvPr id="0" name="14-identifiers.png"/>
                     <pic:cNvPicPr/>
                   </pic:nvPicPr>
                   <pic:blipFill>
@@ -387,7 +192,7 @@
                   <pic:spPr>
                     <a:xfrm>
                       <a:off x="0" y="0"/>
-                      <a:ext cx="3701142" cy="4663439"/>
+                      <a:ext cx="2536936" cy="4206240"/>
                     </a:xfrm>
                     <a:prstGeom prst="rect"/>
                   </pic:spPr>
@@ -406,7 +211,104 @@
         <w:rPr>
           <w:rFonts w:eastAsia="Arial Unicode MS" w:ascii="Arial Unicode MS" w:hAnsi="Arial Unicode MS"/>
         </w:rPr>
-        <w:t>图1｜操作指令卡。安装与配置命令在电脑终端输入；文献任务在启动 Hermes 后输入。</w:t>
+        <w:t>图1｜标识符对照图，非软件截图。题名、作者、年份与编号应在题录中相互核对。</w:t>
+      </w:r>
+    </w:p>
+    <w:p>
+      <w:pPr/>
+      <w:r>
+        <w:rPr>
+          <w:rFonts w:eastAsia="Arial Unicode MS" w:ascii="Arial Unicode MS" w:hAnsi="Arial Unicode MS"/>
+        </w:rPr>
+        <w:t>只有题名时，同时提供作者或年份；有 DOI、PMID 时保留完整编号。取得全文后，记录来源和实际版本。来源只提供 HTML、XML 或 TXT 时，按真实格式保存，不能改名为 PDF。</w:t>
+      </w:r>
+    </w:p>
+    <w:p>
+      <w:pPr>
+        <w:pStyle w:val="Heading1"/>
+      </w:pPr>
+      <w:r>
+        <w:rPr>
+          <w:rFonts w:eastAsia="Arial Unicode MS" w:ascii="Arial Unicode MS" w:hAnsi="Arial Unicode MS"/>
+        </w:rPr>
+        <w:t>02 打开终端，分清两种输入位置</w:t>
+      </w:r>
+    </w:p>
+    <w:p>
+      <w:pPr/>
+      <w:r>
+        <w:rPr>
+          <w:rFonts w:eastAsia="Arial Unicode MS" w:ascii="Arial Unicode MS" w:hAnsi="Arial Unicode MS"/>
+        </w:rPr>
+        <w:t xml:space="preserve">macOS 按 </w:t>
+      </w:r>
+      <w:r>
+        <w:rPr>
+          <w:rFonts w:ascii="Menlo" w:hAnsi="Menlo" w:eastAsia="Arial Unicode MS"/>
+          <w:sz w:val="18"/>
+        </w:rPr>
+        <w:t>⌘ + 空格</w:t>
+      </w:r>
+      <w:r>
+        <w:rPr>
+          <w:rFonts w:eastAsia="Arial Unicode MS" w:ascii="Arial Unicode MS" w:hAnsi="Arial Unicode MS"/>
+        </w:rPr>
+        <w:t>，搜索“终端”并打开；Windows 从开始菜单搜索 PowerShell，或打开 Windows Terminal 的 PowerShell 标签页。</w:t>
+      </w:r>
+    </w:p>
+    <w:p>
+      <w:pPr>
+        <w:keepNext/>
+        <w:spacing w:after="80"/>
+        <w:jc w:val="center"/>
+      </w:pPr>
+      <w:r>
+        <w:rPr>
+          <w:rFonts w:eastAsia="Arial Unicode MS" w:ascii="Arial Unicode MS" w:hAnsi="Arial Unicode MS"/>
+        </w:rPr>
+        <w:drawing>
+          <wp:inline xmlns:a="http://schemas.openxmlformats.org/drawingml/2006/main" xmlns:pic="http://schemas.openxmlformats.org/drawingml/2006/picture">
+            <wp:extent cx="2756382" cy="4206239"/>
+            <wp:docPr id="3" name="Picture 3" descr="图2 打开终端与进入 Hermes"/>
+            <wp:cNvGraphicFramePr>
+              <a:graphicFrameLocks noChangeAspect="1"/>
+            </wp:cNvGraphicFramePr>
+            <a:graphic>
+              <a:graphicData uri="http://schemas.openxmlformats.org/drawingml/2006/picture">
+                <pic:pic>
+                  <pic:nvPicPr>
+                    <pic:cNvPr id="0" name="15-open-terminal.png"/>
+                    <pic:cNvPicPr/>
+                  </pic:nvPicPr>
+                  <pic:blipFill>
+                    <a:blip r:embed="rId12"/>
+                    <a:stretch>
+                      <a:fillRect/>
+                    </a:stretch>
+                  </pic:blipFill>
+                  <pic:spPr>
+                    <a:xfrm>
+                      <a:off x="0" y="0"/>
+                      <a:ext cx="2756382" cy="4206239"/>
+                    </a:xfrm>
+                    <a:prstGeom prst="rect"/>
+                  </pic:spPr>
+                </pic:pic>
+              </a:graphicData>
+            </a:graphic>
+          </wp:inline>
+        </w:drawing>
+      </w:r>
+    </w:p>
+    <w:p>
+      <w:pPr>
+        <w:pStyle w:val="HermesCaption"/>
+      </w:pPr>
+      <w:r>
+        <w:rPr>
+          <w:rFonts w:eastAsia="Arial Unicode MS" w:ascii="Arial Unicode MS" w:hAnsi="Arial Unicode MS"/>
+        </w:rPr>
+        <w:t>图2｜系统操作指引，非软件截图。先运行电脑命令，再进入 Hermes 对话。</w:t>
       </w:r>
     </w:p>
     <w:p>
@@ -416,13 +318,13 @@
           <w:rFonts w:eastAsia="Arial Unicode MS" w:ascii="Arial Unicode MS" w:hAnsi="Arial Unicode MS"/>
           <w:b/>
         </w:rPr>
-        <w:t>在电脑终端输入的内容</w:t>
+        <w:t>电脑终端</w:t>
       </w:r>
       <w:r>
         <w:rPr>
           <w:rFonts w:eastAsia="Arial Unicode MS" w:ascii="Arial Unicode MS" w:hAnsi="Arial Unicode MS"/>
         </w:rPr>
-        <w:t xml:space="preserve">，通常像 </w:t>
+        <w:t xml:space="preserve">输入安装、配置和启动命令，如 </w:t>
       </w:r>
       <w:r>
         <w:rPr>
@@ -461,7 +363,40 @@
         <w:rPr>
           <w:rFonts w:eastAsia="Arial Unicode MS" w:ascii="Arial Unicode MS" w:hAnsi="Arial Unicode MS"/>
         </w:rPr>
-        <w:t>。macOS 可以通过系统搜索打开“终端”；Windows 打开 PowerShell 或 Windows Terminal 的 PowerShell 标签页。</w:t>
+        <w:t>。</w:t>
+      </w:r>
+      <w:r>
+        <w:rPr>
+          <w:rFonts w:eastAsia="Arial Unicode MS" w:ascii="Arial Unicode MS" w:hAnsi="Arial Unicode MS"/>
+          <w:b/>
+        </w:rPr>
+        <w:t>Hermes 对话输入区</w:t>
+      </w:r>
+      <w:r>
+        <w:rPr>
+          <w:rFonts w:eastAsia="Arial Unicode MS" w:ascii="Arial Unicode MS" w:hAnsi="Arial Unicode MS"/>
+        </w:rPr>
+        <w:t>粘贴自然语言任务，如“请下载这篇论文并保存清单”。一个命令执行完再输入下一个；命令块内没有附加提示符，可以直接复制。</w:t>
+      </w:r>
+    </w:p>
+    <w:p>
+      <w:pPr>
+        <w:pStyle w:val="Heading1"/>
+      </w:pPr>
+      <w:r>
+        <w:rPr>
+          <w:rFonts w:eastAsia="Arial Unicode MS" w:ascii="Arial Unicode MS" w:hAnsi="Arial Unicode MS"/>
+        </w:rPr>
+        <w:t>03 安装并确认命令可用</w:t>
+      </w:r>
+    </w:p>
+    <w:p>
+      <w:pPr/>
+      <w:r>
+        <w:rPr>
+          <w:rFonts w:eastAsia="Arial Unicode MS" w:ascii="Arial Unicode MS" w:hAnsi="Arial Unicode MS"/>
+        </w:rPr>
+        <w:t>准备电脑、网络和一种可在 Hermes 配置的模型服务。模型和部分网页服务可能收费，先用一篇论文练习。</w:t>
       </w:r>
     </w:p>
     <w:p>
@@ -471,112 +406,40 @@
           <w:rFonts w:eastAsia="Arial Unicode MS" w:ascii="Arial Unicode MS" w:hAnsi="Arial Unicode MS"/>
           <w:b/>
         </w:rPr>
-        <w:t>发给 Hermes 的内容</w:t>
+        <w:t>先核对系统支持。</w:t>
       </w:r>
       <w:r>
         <w:rPr>
           <w:rFonts w:eastAsia="Arial Unicode MS" w:ascii="Arial Unicode MS" w:hAnsi="Arial Unicode MS"/>
         </w:rPr>
-        <w:t>，通常是一段自然语言，例如“请下载这篇论文并保存清单”。先启动 Hermes，看到对话输入提示后再粘贴任务。</w:t>
+        <w:t xml:space="preserve"> 当前官方表列出 Apple Silicon macOS、Windows、Linux 支持；Intel macOS 当前不受支持。架构和依赖以</w:t>
       </w:r>
-    </w:p>
-    <w:p>
-      <w:pPr/>
+      <w:hyperlink r:id="rId13">
+        <w:r>
+          <w:rPr>
+            <w:color w:val="197B82"/>
+          </w:rPr>
+          <w:t>官方平台表</w:t>
+        </w:r>
+      </w:hyperlink>
       <w:r>
         <w:rPr>
           <w:rFonts w:eastAsia="Arial Unicode MS" w:ascii="Arial Unicode MS" w:hAnsi="Arial Unicode MS"/>
         </w:rPr>
-        <w:t xml:space="preserve">文章中的命令块没有附加 </w:t>
+        <w:t xml:space="preserve">为准。已有安装先试 </w:t>
       </w:r>
       <w:r>
         <w:rPr>
           <w:rFonts w:ascii="Menlo" w:hAnsi="Menlo" w:eastAsia="Arial Unicode MS"/>
           <w:sz w:val="18"/>
         </w:rPr>
-        <w:t>$</w:t>
+        <w:t>hermes --help</w:t>
       </w:r>
       <w:r>
         <w:rPr>
           <w:rFonts w:eastAsia="Arial Unicode MS" w:ascii="Arial Unicode MS" w:hAnsi="Arial Unicode MS"/>
         </w:rPr>
-        <w:t>、</w:t>
-      </w:r>
-      <w:r>
-        <w:rPr>
-          <w:rFonts w:ascii="Menlo" w:hAnsi="Menlo" w:eastAsia="Arial Unicode MS"/>
-          <w:sz w:val="18"/>
-        </w:rPr>
-        <w:t>PS&gt;</w:t>
-      </w:r>
-      <w:r>
-        <w:rPr>
-          <w:rFonts w:eastAsia="Arial Unicode MS" w:ascii="Arial Unicode MS" w:hAnsi="Arial Unicode MS"/>
-        </w:rPr>
-        <w:t xml:space="preserve"> 或 </w:t>
-      </w:r>
-      <w:r>
-        <w:rPr>
-          <w:rFonts w:ascii="Menlo" w:hAnsi="Menlo" w:eastAsia="Arial Unicode MS"/>
-          <w:sz w:val="18"/>
-        </w:rPr>
-        <w:t>❯</w:t>
-      </w:r>
-      <w:r>
-        <w:rPr>
-          <w:rFonts w:eastAsia="Arial Unicode MS" w:ascii="Arial Unicode MS" w:hAnsi="Arial Unicode MS"/>
-        </w:rPr>
-        <w:t>，复制时直接使用块内文字。一个命令执行完再执行下一个；自然语言提示词则可以整段发送。终端里需要手动换行输入时，可参考官方说明使用 Alt+Enter 或 Ctrl+J。</w:t>
-      </w:r>
-      <w:hyperlink r:id="rId12">
-        <w:r>
-          <w:rPr>
-            <w:color w:val="197B82"/>
-          </w:rPr>
-          <w:t>Hermes 多行输入说明</w:t>
-        </w:r>
-      </w:hyperlink>
-    </w:p>
-    <w:p>
-      <w:pPr>
-        <w:pStyle w:val="Heading1"/>
-      </w:pPr>
-      <w:r>
-        <w:rPr>
-          <w:rFonts w:eastAsia="Arial Unicode MS" w:ascii="Arial Unicode MS" w:hAnsi="Arial Unicode MS"/>
-        </w:rPr>
-        <w:t>03 安装 Hermes 并确认命令可以运行</w:t>
-      </w:r>
-    </w:p>
-    <w:p>
-      <w:pPr/>
-      <w:r>
-        <w:rPr>
-          <w:rFonts w:eastAsia="Arial Unicode MS" w:ascii="Arial Unicode MS" w:hAnsi="Arial Unicode MS"/>
-        </w:rPr>
-        <w:t>准备好三样东西：一台电脑、可用的网络、一个可以在 Hermes 中配置的模型服务。模型推理和部分网页服务可能收费，额度以你实际选择的服务为准。第一次只处理一篇论文，便于观察用量和排查问题。</w:t>
-      </w:r>
-    </w:p>
-    <w:p>
-      <w:pPr/>
-      <w:r>
-        <w:rPr>
-          <w:rFonts w:eastAsia="Arial Unicode MS" w:ascii="Arial Unicode MS" w:hAnsi="Arial Unicode MS"/>
-        </w:rPr>
-        <w:t xml:space="preserve">如果喜欢安装包，可以从 </w:t>
-      </w:r>
-      <w:hyperlink r:id="rId13">
-        <w:r>
-          <w:rPr>
-            <w:color w:val="197B82"/>
-          </w:rPr>
-          <w:t>Hermes 官方网站</w:t>
-        </w:r>
-      </w:hyperlink>
-      <w:r>
-        <w:rPr>
-          <w:rFonts w:eastAsia="Arial Unicode MS" w:ascii="Arial Unicode MS" w:hAnsi="Arial Unicode MS"/>
-        </w:rPr>
-        <w:t xml:space="preserve"> 进入桌面端下载页面，按系统选择。下面使用命令行路线，后面的步骤都按这条路线展开。</w:t>
+        <w:t>。</w:t>
       </w:r>
     </w:p>
     <w:p>
@@ -591,8 +454,8 @@
         </w:rPr>
         <w:drawing>
           <wp:inline xmlns:a="http://schemas.openxmlformats.org/drawingml/2006/main" xmlns:pic="http://schemas.openxmlformats.org/drawingml/2006/picture">
-            <wp:extent cx="2909195" cy="4663440"/>
-            <wp:docPr id="3" name="Picture 3" descr="图2 macOS 和 Windows 的官方安装命令"/>
+            <wp:extent cx="2623980" cy="4206240"/>
+            <wp:docPr id="4" name="Picture 4" descr="图3 官方安装命令"/>
             <wp:cNvGraphicFramePr>
               <a:graphicFrameLocks noChangeAspect="1"/>
             </wp:cNvGraphicFramePr>
@@ -612,7 +475,7 @@
                   <pic:spPr>
                     <a:xfrm>
                       <a:off x="0" y="0"/>
-                      <a:ext cx="2909195" cy="4663440"/>
+                      <a:ext cx="2623980" cy="4206240"/>
                     </a:xfrm>
                     <a:prstGeom prst="rect"/>
                   </pic:spPr>
@@ -631,23 +494,18 @@
         <w:rPr>
           <w:rFonts w:eastAsia="Arial Unicode MS" w:ascii="Arial Unicode MS" w:hAnsi="Arial Unicode MS"/>
         </w:rPr>
-        <w:t>图2｜官方安装命令指令卡。两种系统选择其一；请从下面的正文复制完整命令。</w:t>
+        <w:t>图3｜安装指令卡。按系统选一条，从正文复制完整命令。</w:t>
       </w:r>
     </w:p>
     <w:p>
-      <w:pPr/>
-      <w:r>
-        <w:rPr>
-          <w:rFonts w:eastAsia="Arial Unicode MS" w:ascii="Arial Unicode MS" w:hAnsi="Arial Unicode MS"/>
-          <w:b/>
-        </w:rPr>
-        <w:t>macOS、Linux 或 WSL2</w:t>
-      </w:r>
+      <w:pPr>
+        <w:keepNext/>
+      </w:pPr>
       <w:r>
         <w:rPr>
           <w:rFonts w:eastAsia="Arial Unicode MS" w:ascii="Arial Unicode MS" w:hAnsi="Arial Unicode MS"/>
         </w:rPr>
-        <w:t>，在电脑终端输入：</w:t>
+        <w:t>macOS、Linux 或 WSL2，在电脑终端输入：</w:t>
       </w:r>
     </w:p>
     <w:p>
@@ -664,19 +522,14 @@
       </w:r>
     </w:p>
     <w:p>
-      <w:pPr/>
-      <w:r>
-        <w:rPr>
-          <w:rFonts w:eastAsia="Arial Unicode MS" w:ascii="Arial Unicode MS" w:hAnsi="Arial Unicode MS"/>
-          <w:b/>
-        </w:rPr>
-        <w:t>Windows 原生 PowerShell</w:t>
-      </w:r>
+      <w:pPr>
+        <w:keepNext/>
+      </w:pPr>
       <w:r>
         <w:rPr>
           <w:rFonts w:eastAsia="Arial Unicode MS" w:ascii="Arial Unicode MS" w:hAnsi="Arial Unicode MS"/>
         </w:rPr>
-        <w:t>，在 PowerShell 输入：</w:t>
+        <w:t>Windows 原生 PowerShell 输入：</w:t>
       </w:r>
     </w:p>
     <w:p>
@@ -693,12 +546,14 @@
       </w:r>
     </w:p>
     <w:p>
-      <w:pPr/>
+      <w:pPr>
+        <w:keepNext/>
+      </w:pPr>
       <w:r>
         <w:rPr>
           <w:rFonts w:eastAsia="Arial Unicode MS" w:ascii="Arial Unicode MS" w:hAnsi="Arial Unicode MS"/>
         </w:rPr>
-        <w:t>这两条是官方提供的在线安装脚本命令。安装过程中按提示完成；结束后关闭并重新打开终端，输入：</w:t>
+        <w:t>按官方脚本提示安装，结束后重新打开终端，输入：</w:t>
       </w:r>
     </w:p>
     <w:p>
@@ -721,13 +576,13 @@
           <w:rFonts w:eastAsia="Arial Unicode MS" w:ascii="Arial Unicode MS" w:hAnsi="Arial Unicode MS"/>
           <w:b/>
         </w:rPr>
-        <w:t>完成标准：终端能显示 Hermes 的命令帮助。</w:t>
+        <w:t>完成标准：显示 Hermes 命令帮助。</w:t>
       </w:r>
       <w:r>
         <w:rPr>
           <w:rFonts w:eastAsia="Arial Unicode MS" w:ascii="Arial Unicode MS" w:hAnsi="Arial Unicode MS"/>
         </w:rPr>
-        <w:t xml:space="preserve"> 如果出现“command not found”或“不被识别”，先按官方安装指南检查安装结果和 PATH，重新打开终端后再试。</w:t>
+        <w:t xml:space="preserve"> 出现“command not found”或“不被识别”，按</w:t>
       </w:r>
       <w:hyperlink r:id="rId15">
         <w:r>
@@ -737,6 +592,12 @@
           <w:t>官方安装指南</w:t>
         </w:r>
       </w:hyperlink>
+      <w:r>
+        <w:rPr>
+          <w:rFonts w:eastAsia="Arial Unicode MS" w:ascii="Arial Unicode MS" w:hAnsi="Arial Unicode MS"/>
+        </w:rPr>
+        <w:t>检查安装与 PATH。</w:t>
+      </w:r>
     </w:p>
     <w:p>
       <w:pPr>
@@ -746,7 +607,7 @@
         <w:rPr>
           <w:rFonts w:eastAsia="Arial Unicode MS" w:ascii="Arial Unicode MS" w:hAnsi="Arial Unicode MS"/>
         </w:rPr>
-        <w:t>04 配好模型 工具和工作文件夹</w:t>
+        <w:t>04 配置模型、工具和文件位置</w:t>
       </w:r>
     </w:p>
     <w:p>
@@ -757,16 +618,18 @@
         <w:rPr>
           <w:rFonts w:eastAsia="Arial Unicode MS" w:ascii="Arial Unicode MS" w:hAnsi="Arial Unicode MS"/>
         </w:rPr>
-        <w:t>第一步 配置一个能正常回答的模型</w:t>
+        <w:t>先让模型正常回答</w:t>
       </w:r>
     </w:p>
     <w:p>
-      <w:pPr/>
+      <w:pPr>
+        <w:keepNext/>
+      </w:pPr>
       <w:r>
         <w:rPr>
           <w:rFonts w:eastAsia="Arial Unicode MS" w:ascii="Arial Unicode MS" w:hAnsi="Arial Unicode MS"/>
         </w:rPr>
-        <w:t>首次使用，在电脑终端输入：</w:t>
+        <w:t>在电脑终端输入：</w:t>
       </w:r>
     </w:p>
     <w:p>
@@ -788,7 +651,7 @@
         <w:rPr>
           <w:rFonts w:eastAsia="Arial Unicode MS" w:ascii="Arial Unicode MS" w:hAnsi="Arial Unicode MS"/>
         </w:rPr>
-        <w:t xml:space="preserve">按照向导选择模型服务并完成认证。如果已有配置、只想切换模型，使用 </w:t>
+        <w:t xml:space="preserve">按向导选择服务、认证和模型；已有配置只切换模型时用 </w:t>
       </w:r>
       <w:r>
         <w:rPr>
@@ -801,22 +664,86 @@
         <w:rPr>
           <w:rFonts w:eastAsia="Arial Unicode MS" w:ascii="Arial Unicode MS" w:hAnsi="Arial Unicode MS"/>
         </w:rPr>
-        <w:t xml:space="preserve">。已选择 Nous Portal 方案的读者，也可以按官方说明使用 </w:t>
+        <w:t>。API Key 填在配置环节，不粘贴到论文任务里。不同服务的账号和 Key 不能互换，聊天会员也不自动代表有 API 权限。</w:t>
+      </w:r>
+    </w:p>
+    <w:p>
+      <w:pPr>
+        <w:keepNext/>
+        <w:spacing w:after="80"/>
+        <w:jc w:val="center"/>
+      </w:pPr>
+      <w:r>
+        <w:rPr>
+          <w:rFonts w:eastAsia="Arial Unicode MS" w:ascii="Arial Unicode MS" w:hAnsi="Arial Unicode MS"/>
+        </w:rPr>
+        <w:drawing>
+          <wp:inline xmlns:a="http://schemas.openxmlformats.org/drawingml/2006/main" xmlns:pic="http://schemas.openxmlformats.org/drawingml/2006/picture">
+            <wp:extent cx="2890886" cy="4206239"/>
+            <wp:docPr id="5" name="Picture 5" descr="图4 选择模型与认证"/>
+            <wp:cNvGraphicFramePr>
+              <a:graphicFrameLocks noChangeAspect="1"/>
+            </wp:cNvGraphicFramePr>
+            <a:graphic>
+              <a:graphicData uri="http://schemas.openxmlformats.org/drawingml/2006/picture">
+                <pic:pic>
+                  <pic:nvPicPr>
+                    <pic:cNvPr id="0" name="16-model-auth.png"/>
+                    <pic:cNvPicPr/>
+                  </pic:nvPicPr>
+                  <pic:blipFill>
+                    <a:blip r:embed="rId16"/>
+                    <a:stretch>
+                      <a:fillRect/>
+                    </a:stretch>
+                  </pic:blipFill>
+                  <pic:spPr>
+                    <a:xfrm>
+                      <a:off x="0" y="0"/>
+                      <a:ext cx="2890886" cy="4206239"/>
+                    </a:xfrm>
+                    <a:prstGeom prst="rect"/>
+                  </pic:spPr>
+                </pic:pic>
+              </a:graphicData>
+            </a:graphic>
+          </wp:inline>
+        </w:drawing>
+      </w:r>
+    </w:p>
+    <w:p>
+      <w:pPr>
+        <w:pStyle w:val="HermesCaption"/>
+      </w:pPr>
+      <w:r>
+        <w:rPr>
+          <w:rFonts w:eastAsia="Arial Unicode MS" w:ascii="Arial Unicode MS" w:hAnsi="Arial Unicode MS"/>
+        </w:rPr>
+        <w:t>图4｜配置指引，非软件截图。菜单以当前向导为准。</w:t>
+      </w:r>
+    </w:p>
+    <w:p>
+      <w:pPr/>
+      <w:r>
+        <w:rPr>
+          <w:rFonts w:eastAsia="Arial Unicode MS" w:ascii="Arial Unicode MS" w:hAnsi="Arial Unicode MS"/>
+        </w:rPr>
+        <w:t xml:space="preserve">当前官方快速入门要求模型上下文至少 </w:t>
       </w:r>
       <w:r>
         <w:rPr>
-          <w:rFonts w:ascii="Menlo" w:hAnsi="Menlo" w:eastAsia="Arial Unicode MS"/>
-          <w:sz w:val="18"/>
+          <w:rFonts w:eastAsia="Arial Unicode MS" w:ascii="Arial Unicode MS" w:hAnsi="Arial Unicode MS"/>
+          <w:b/>
         </w:rPr>
-        <w:t>hermes setup --portal</w:t>
+        <w:t>64K tokens</w:t>
       </w:r>
       <w:r>
         <w:rPr>
           <w:rFonts w:eastAsia="Arial Unicode MS" w:ascii="Arial Unicode MS" w:hAnsi="Arial Unicode MS"/>
         </w:rPr>
-        <w:t>；这是另一条配置路线，无须把这些命令全部重复运行。</w:t>
+        <w:t>，自建模型尤其要确认。配置好后启动 Hermes，发送“请仅回复：准备好了”；能正常回答再检查工具。</w:t>
       </w:r>
-      <w:hyperlink r:id="rId16">
+      <w:hyperlink r:id="rId17">
         <w:r>
           <w:rPr>
             <w:color w:val="197B82"/>
@@ -826,15 +753,6 @@
       </w:hyperlink>
     </w:p>
     <w:p>
-      <w:pPr/>
-      <w:r>
-        <w:rPr>
-          <w:rFonts w:eastAsia="Arial Unicode MS" w:ascii="Arial Unicode MS" w:hAnsi="Arial Unicode MS"/>
-        </w:rPr>
-        <w:t>认证时使用向导提供的流程。API Key 应在配置环节填写，不要粘贴到论文下载提示词里。</w:t>
-      </w:r>
-    </w:p>
-    <w:p>
       <w:pPr>
         <w:pStyle w:val="Heading2"/>
       </w:pPr>
@@ -842,11 +760,13 @@
         <w:rPr>
           <w:rFonts w:eastAsia="Arial Unicode MS" w:ascii="Arial Unicode MS" w:hAnsi="Arial Unicode MS"/>
         </w:rPr>
-        <w:t>第二步 让文献任务需要的工具可用</w:t>
+        <w:t>再确认搜索、读取和保存能力</w:t>
       </w:r>
     </w:p>
     <w:p>
-      <w:pPr/>
+      <w:pPr>
+        <w:keepNext/>
+      </w:pPr>
       <w:r>
         <w:rPr>
           <w:rFonts w:eastAsia="Arial Unicode MS" w:ascii="Arial Unicode MS" w:hAnsi="Arial Unicode MS"/>
@@ -873,38 +793,8 @@
         <w:rPr>
           <w:rFonts w:eastAsia="Arial Unicode MS" w:ascii="Arial Unicode MS" w:hAnsi="Arial Unicode MS"/>
         </w:rPr>
-        <w:t>为本文使用的 CLI 平台配置网页搜索、终端执行和文件操作。需要点击网页或处理动态页面时，再配置浏览器工具。</w:t>
+        <w:t>为本文的 CLI 平台配置网页搜索、内容提取、终端和文件工具；需要点击或动态页面时再配置浏览器。搜索返回链接、提取读到题录、文件实际保存，是三个不同结果。</w:t>
       </w:r>
-    </w:p>
-    <w:p>
-      <w:pPr/>
-      <w:r>
-        <w:rPr>
-          <w:rFonts w:eastAsia="Arial Unicode MS" w:ascii="Arial Unicode MS" w:hAnsi="Arial Unicode MS"/>
-        </w:rPr>
-        <w:t xml:space="preserve">网页搜索配置中可找到 </w:t>
-      </w:r>
-      <w:r>
-        <w:rPr>
-          <w:rFonts w:eastAsia="Arial Unicode MS" w:ascii="Arial Unicode MS" w:hAnsi="Arial Unicode MS"/>
-          <w:b/>
-        </w:rPr>
-        <w:t>Web Search &amp; Extract</w:t>
-      </w:r>
-      <w:r>
-        <w:rPr>
-          <w:rFonts w:eastAsia="Arial Unicode MS" w:ascii="Arial Unicode MS" w:hAnsi="Arial Unicode MS"/>
-        </w:rPr>
-        <w:t>。搜索用于找入口，网页内容提取用于读取页面，实际保存 PDF 还需要终端或其他下载能力。某些服务只支持搜索；如果提取工具报告“search-only backend”，按配置向导或文档增加可提取网页内容的服务。当前文档提供多种服务和部分无密钥路线，免费路线仍可能受到限流；不要把“无需单独密钥”理解为无限使用。</w:t>
-      </w:r>
-      <w:hyperlink r:id="rId17">
-        <w:r>
-          <w:rPr>
-            <w:color w:val="197B82"/>
-          </w:rPr>
-          <w:t>官方网页工具配置</w:t>
-        </w:r>
-      </w:hyperlink>
     </w:p>
     <w:p>
       <w:pPr>
@@ -918,8 +808,8 @@
         </w:rPr>
         <w:drawing>
           <wp:inline xmlns:a="http://schemas.openxmlformats.org/drawingml/2006/main" xmlns:pic="http://schemas.openxmlformats.org/drawingml/2006/picture">
-            <wp:extent cx="2868044" cy="4663440"/>
-            <wp:docPr id="4" name="Picture 4" descr="图3 模型工具和工作目录的配置顺序"/>
+            <wp:extent cx="3017388" cy="4206239"/>
+            <wp:docPr id="6" name="Picture 6" descr="图5 文献任务需要的工具"/>
             <wp:cNvGraphicFramePr>
               <a:graphicFrameLocks noChangeAspect="1"/>
             </wp:cNvGraphicFramePr>
@@ -927,7 +817,7 @@
               <a:graphicData uri="http://schemas.openxmlformats.org/drawingml/2006/picture">
                 <pic:pic>
                   <pic:nvPicPr>
-                    <pic:cNvPr id="0" name="03-setup.png"/>
+                    <pic:cNvPr id="0" name="17-tool-matrix.png"/>
                     <pic:cNvPicPr/>
                   </pic:nvPicPr>
                   <pic:blipFill>
@@ -939,7 +829,7 @@
                   <pic:spPr>
                     <a:xfrm>
                       <a:off x="0" y="0"/>
-                      <a:ext cx="2868044" cy="4663440"/>
+                      <a:ext cx="3017388" cy="4206239"/>
                     </a:xfrm>
                     <a:prstGeom prst="rect"/>
                   </pic:spPr>
@@ -958,8 +848,38 @@
         <w:rPr>
           <w:rFonts w:eastAsia="Arial Unicode MS" w:ascii="Arial Unicode MS" w:hAnsi="Arial Unicode MS"/>
         </w:rPr>
-        <w:t>图3｜配置顺序图。每一步完成后做一次小检查，再进入文献下载。</w:t>
+        <w:t>图5｜工具能力图，非软件截图。逐项确认实际能力。</w:t>
       </w:r>
+    </w:p>
+    <w:p>
+      <w:pPr/>
+      <w:r>
+        <w:rPr>
+          <w:rFonts w:eastAsia="Arial Unicode MS" w:ascii="Arial Unicode MS" w:hAnsi="Arial Unicode MS"/>
+        </w:rPr>
+        <w:t xml:space="preserve">网页配置中的 </w:t>
+      </w:r>
+      <w:r>
+        <w:rPr>
+          <w:rFonts w:eastAsia="Arial Unicode MS" w:ascii="Arial Unicode MS" w:hAnsi="Arial Unicode MS"/>
+          <w:b/>
+        </w:rPr>
+        <w:t>Web Search &amp; Extract</w:t>
+      </w:r>
+      <w:r>
+        <w:rPr>
+          <w:rFonts w:eastAsia="Arial Unicode MS" w:ascii="Arial Unicode MS" w:hAnsi="Arial Unicode MS"/>
+        </w:rPr>
+        <w:t xml:space="preserve"> 可以提供搜索和提取。出现“search-only backend”，按向导增加提取服务。部分路线无需单独密钥，仍可能限流。</w:t>
+      </w:r>
+      <w:hyperlink r:id="rId19">
+        <w:r>
+          <w:rPr>
+            <w:color w:val="197B82"/>
+          </w:rPr>
+          <w:t>网页工具配置</w:t>
+        </w:r>
+      </w:hyperlink>
     </w:p>
     <w:p>
       <w:pPr>
@@ -969,7 +889,7 @@
         <w:rPr>
           <w:rFonts w:eastAsia="Arial Unicode MS" w:ascii="Arial Unicode MS" w:hAnsi="Arial Unicode MS"/>
         </w:rPr>
-        <w:t>第三步 在专用文件夹里启动 Hermes</w:t>
+        <w:t>最后在专用文件夹启动</w:t>
       </w:r>
     </w:p>
     <w:p>
@@ -978,20 +898,20 @@
         <w:rPr>
           <w:rFonts w:eastAsia="Arial Unicode MS" w:ascii="Arial Unicode MS" w:hAnsi="Arial Unicode MS"/>
         </w:rPr>
-        <w:t xml:space="preserve">本篇新手练习采用 </w:t>
+        <w:t xml:space="preserve">本教程采用 </w:t>
       </w:r>
       <w:r>
         <w:rPr>
           <w:rFonts w:eastAsia="Arial Unicode MS" w:ascii="Arial Unicode MS" w:hAnsi="Arial Unicode MS"/>
           <w:b/>
         </w:rPr>
-        <w:t>local 终端后端</w:t>
+        <w:t>local 本机后端</w:t>
       </w:r>
       <w:r>
         <w:rPr>
           <w:rFonts w:eastAsia="Arial Unicode MS" w:ascii="Arial Unicode MS" w:hAnsi="Arial Unicode MS"/>
         </w:rPr>
-        <w:t xml:space="preserve">，任务在本机执行。请在 </w:t>
+        <w:t xml:space="preserve">。在 </w:t>
       </w:r>
       <w:r>
         <w:rPr>
@@ -1004,7 +924,7 @@
         <w:rPr>
           <w:rFonts w:eastAsia="Arial Unicode MS" w:ascii="Arial Unicode MS" w:hAnsi="Arial Unicode MS"/>
         </w:rPr>
-        <w:t xml:space="preserve"> 中确认后端；新建练习环境若要明确使用本机，可以在电脑终端运行：</w:t>
+        <w:t xml:space="preserve"> 核对；新建练习环境要明确使用本机时，可依次运行：</w:t>
       </w:r>
     </w:p>
     <w:p>
@@ -1028,31 +948,26 @@
         <w:rPr>
           <w:rFonts w:eastAsia="Arial Unicode MS" w:ascii="Arial Unicode MS" w:hAnsi="Arial Unicode MS"/>
         </w:rPr>
-        <w:t>已经使用 Docker、SSH 或云端环境的读者，应根据自己的运行环境安排工作目录和文件取回方式。上面两条会修改后端和工作目录设置。local 后端以你的电脑账号权限执行操作，专用文件夹用于组织文件，并不是访问隔离。</w:t>
+        <w:t>这两条会改变后端与工作目录设置。local 以你的账号权限执行，专用文件夹用于整理，不是权限隔离；已有容器或远程环境应按实际环境取回文件。</w:t>
       </w:r>
-      <w:hyperlink r:id="rId19">
+      <w:hyperlink r:id="rId20">
         <w:r>
           <w:rPr>
             <w:color w:val="197B82"/>
           </w:rPr>
-          <w:t>终端后端及工作目录说明</w:t>
+          <w:t>工作目录说明</w:t>
         </w:r>
       </w:hyperlink>
     </w:p>
     <w:p>
-      <w:pPr/>
-      <w:r>
-        <w:rPr>
-          <w:rFonts w:eastAsia="Arial Unicode MS" w:ascii="Arial Unicode MS" w:hAnsi="Arial Unicode MS"/>
-          <w:b/>
-        </w:rPr>
-        <w:t>macOS、Linux 或 WSL2</w:t>
-      </w:r>
+      <w:pPr>
+        <w:keepNext/>
+      </w:pPr>
       <w:r>
         <w:rPr>
           <w:rFonts w:eastAsia="Arial Unicode MS" w:ascii="Arial Unicode MS" w:hAnsi="Arial Unicode MS"/>
         </w:rPr>
-        <w:t>，在电脑终端依次输入：</w:t>
+        <w:t>macOS、Linux 或 WSL2，依次输入：</w:t>
       </w:r>
     </w:p>
     <w:p>
@@ -1073,19 +988,14 @@
       </w:r>
     </w:p>
     <w:p>
-      <w:pPr/>
-      <w:r>
-        <w:rPr>
-          <w:rFonts w:eastAsia="Arial Unicode MS" w:ascii="Arial Unicode MS" w:hAnsi="Arial Unicode MS"/>
-          <w:b/>
-        </w:rPr>
-        <w:t>Windows PowerShell</w:t>
-      </w:r>
+      <w:pPr>
+        <w:keepNext/>
+      </w:pPr>
       <w:r>
         <w:rPr>
           <w:rFonts w:eastAsia="Arial Unicode MS" w:ascii="Arial Unicode MS" w:hAnsi="Arial Unicode MS"/>
         </w:rPr>
-        <w:t>，依次输入：</w:t>
+        <w:t>Windows PowerShell，依次输入：</w:t>
       </w:r>
     </w:p>
     <w:p>
@@ -1106,42 +1016,6 @@
       </w:r>
     </w:p>
     <w:p>
-      <w:pPr/>
-      <w:r>
-        <w:rPr>
-          <w:rFonts w:eastAsia="Arial Unicode MS" w:ascii="Arial Unicode MS" w:hAnsi="Arial Unicode MS"/>
-          <w:b/>
-        </w:rPr>
-        <w:t>完成标准：看到 Hermes 对话输入提示，并能正常交谈。</w:t>
-      </w:r>
-      <w:r>
-        <w:rPr>
-          <w:rFonts w:eastAsia="Arial Unicode MS" w:ascii="Arial Unicode MS" w:hAnsi="Arial Unicode MS"/>
-        </w:rPr>
-        <w:t xml:space="preserve"> 先发送“请仅回复：准备好了”，确认模型可以回答。接下来所有以“请……”开头的提示词，都发到这个对话输入区。</w:t>
-      </w:r>
-    </w:p>
-    <w:p>
-      <w:pPr>
-        <w:pStyle w:val="Heading1"/>
-      </w:pPr>
-      <w:r>
-        <w:rPr>
-          <w:rFonts w:eastAsia="Arial Unicode MS" w:ascii="Arial Unicode MS" w:hAnsi="Arial Unicode MS"/>
-        </w:rPr>
-        <w:t>05 下载前做一次可验证的环境检查</w:t>
-      </w:r>
-    </w:p>
-    <w:p>
-      <w:pPr/>
-      <w:r>
-        <w:rPr>
-          <w:rFonts w:eastAsia="Arial Unicode MS" w:ascii="Arial Unicode MS" w:hAnsi="Arial Unicode MS"/>
-        </w:rPr>
-        <w:t>不要只问 Hermes“你能不能下载论文”。让它执行一个小任务，才能看到联网和文件读写是否实际工作。</w:t>
-      </w:r>
-    </w:p>
-    <w:p>
       <w:pPr>
         <w:keepNext/>
         <w:spacing w:after="80"/>
@@ -1153,8 +1027,8 @@
         </w:rPr>
         <w:drawing>
           <wp:inline xmlns:a="http://schemas.openxmlformats.org/drawingml/2006/main" xmlns:pic="http://schemas.openxmlformats.org/drawingml/2006/picture">
-            <wp:extent cx="3268002" cy="4663439"/>
-            <wp:docPr id="5" name="Picture 5" descr="图4 下载前的三项环境检查"/>
+            <wp:extent cx="2731324" cy="4206239"/>
+            <wp:docPr id="7" name="Picture 7" descr="图6 工作目录与文件位置"/>
             <wp:cNvGraphicFramePr>
               <a:graphicFrameLocks noChangeAspect="1"/>
             </wp:cNvGraphicFramePr>
@@ -1162,11 +1036,11 @@
               <a:graphicData uri="http://schemas.openxmlformats.org/drawingml/2006/picture">
                 <pic:pic>
                   <pic:nvPicPr>
-                    <pic:cNvPr id="0" name="04-preflight.png"/>
+                    <pic:cNvPr id="0" name="18-workspace.png"/>
                     <pic:cNvPicPr/>
                   </pic:nvPicPr>
                   <pic:blipFill>
-                    <a:blip r:embed="rId20"/>
+                    <a:blip r:embed="rId21"/>
                     <a:stretch>
                       <a:fillRect/>
                     </a:stretch>
@@ -1174,7 +1048,7 @@
                   <pic:spPr>
                     <a:xfrm>
                       <a:off x="0" y="0"/>
-                      <a:ext cx="3268002" cy="4663439"/>
+                      <a:ext cx="2731324" cy="4206239"/>
                     </a:xfrm>
                     <a:prstGeom prst="rect"/>
                   </pic:spPr>
@@ -1193,11 +1067,40 @@
         <w:rPr>
           <w:rFonts w:eastAsia="Arial Unicode MS" w:ascii="Arial Unicode MS" w:hAnsi="Arial Unicode MS"/>
         </w:rPr>
-        <w:t>图4｜环境检查图。看实际工具结果、文件路径和回读内容。</w:t>
+        <w:t>图6｜路径指引，非软件截图。后面的练习子文件夹都位于实际工作目录内。</w:t>
       </w:r>
     </w:p>
     <w:p>
       <w:pPr/>
+      <w:r>
+        <w:rPr>
+          <w:rFonts w:eastAsia="Arial Unicode MS" w:ascii="Arial Unicode MS" w:hAnsi="Arial Unicode MS"/>
+          <w:b/>
+        </w:rPr>
+        <w:t>完成标准：进入 Hermes 对话并能正常回答。</w:t>
+      </w:r>
+      <w:r>
+        <w:rPr>
+          <w:rFonts w:eastAsia="Arial Unicode MS" w:ascii="Arial Unicode MS" w:hAnsi="Arial Unicode MS"/>
+        </w:rPr>
+        <w:t xml:space="preserve"> 记下后面环境检查返回的绝对路径。Mac 在 Finder“前往文件夹”中粘贴路径；Windows 在资源管理器地址栏粘贴路径。远端路径需从对应环境取回。</w:t>
+      </w:r>
+    </w:p>
+    <w:p>
+      <w:pPr>
+        <w:pStyle w:val="Heading1"/>
+      </w:pPr>
+      <w:r>
+        <w:rPr>
+          <w:rFonts w:eastAsia="Arial Unicode MS" w:ascii="Arial Unicode MS" w:hAnsi="Arial Unicode MS"/>
+        </w:rPr>
+        <w:t>05 先做一次环境检查</w:t>
+      </w:r>
+    </w:p>
+    <w:p>
+      <w:pPr>
+        <w:keepNext/>
+      </w:pPr>
       <w:r>
         <w:rPr>
           <w:rFonts w:eastAsia="Arial Unicode MS" w:ascii="Arial Unicode MS" w:hAnsi="Arial Unicode MS"/>
@@ -1236,190 +1139,58 @@
           <w:rFonts w:eastAsia="Arial Unicode MS" w:ascii="Arial Unicode MS" w:hAnsi="Arial Unicode MS"/>
         </w:rPr>
         <w:br/>
+        <w:t xml:space="preserve">1. </w:t>
       </w:r>
       <w:r>
         <w:rPr>
           <w:rFonts w:eastAsia="Arial Unicode MS" w:ascii="Arial Unicode MS" w:hAnsi="Arial Unicode MS"/>
         </w:rPr>
-        <w:t xml:space="preserve">实际调用终端工具，报告工作目录、操作系统和运行后端。请区分已确认的信息与无法确认的信息。  </w:t>
+        <w:t xml:space="preserve">实际调用终端，报告当前工作目录、操作系统和运行后端；无法确认的信息明确说明。  </w:t>
       </w:r>
       <w:r>
         <w:rPr>
           <w:rFonts w:eastAsia="Arial Unicode MS" w:ascii="Arial Unicode MS" w:hAnsi="Arial Unicode MS"/>
         </w:rPr>
         <w:br/>
+        <w:t xml:space="preserve">2. </w:t>
       </w:r>
       <w:r>
         <w:rPr>
           <w:rFonts w:eastAsia="Arial Unicode MS" w:ascii="Arial Unicode MS" w:hAnsi="Arial Unicode MS"/>
         </w:rPr>
-        <w:t xml:space="preserve">在当前工作目录创建 _check 文件夹，写入 hello.txt，内容为 hermes-literature-check，再读取该文件核对内容。只操作本次新建文件夹。  </w:t>
+        <w:t xml:space="preserve">在当前工作目录新建 _check，写入 hello.txt，内容为 hermes-literature-check，再读取核对。只操作本次新建文件夹。  </w:t>
       </w:r>
       <w:r>
         <w:rPr>
           <w:rFonts w:eastAsia="Arial Unicode MS" w:ascii="Arial Unicode MS" w:hAnsi="Arial Unicode MS"/>
         </w:rPr>
         <w:br/>
+        <w:t xml:space="preserve">3. </w:t>
       </w:r>
       <w:r>
         <w:rPr>
           <w:rFonts w:eastAsia="Arial Unicode MS" w:ascii="Arial Unicode MS" w:hAnsi="Arial Unicode MS"/>
         </w:rPr>
-        <w:t xml:space="preserve">使用网页搜索查找 arXiv:1706.03762，返回你实际找到的官方记录页面，并打开页面核对题名；不要只凭记忆给出链接。  </w:t>
+        <w:t xml:space="preserve">使用网页搜索查找 arXiv:1706.03762，打开实际找到的官方记录页，核对题名。  </w:t>
       </w:r>
       <w:r>
         <w:rPr>
           <w:rFonts w:eastAsia="Arial Unicode MS" w:ascii="Arial Unicode MS" w:hAnsi="Arial Unicode MS"/>
         </w:rPr>
         <w:br/>
+        <w:t xml:space="preserve">4. </w:t>
       </w:r>
       <w:r>
         <w:rPr>
           <w:rFonts w:eastAsia="Arial Unicode MS" w:ascii="Arial Unicode MS" w:hAnsi="Arial Unicode MS"/>
         </w:rPr>
-        <w:t xml:space="preserve">返回检查表，包括使用的工具、成功或失败、错误摘要、测试文件绝对路径。不要输出密钥。  </w:t>
+        <w:t>返回使用的工具、各项结果、错误摘要和测试文件绝对路径；不要输出密钥。任一项失败，先处理，不进入批量任务。</w:t>
       </w:r>
       <w:r>
         <w:rPr>
           <w:rFonts w:eastAsia="Arial Unicode MS" w:ascii="Arial Unicode MS" w:hAnsi="Arial Unicode MS"/>
         </w:rPr>
         <w:br/>
-      </w:r>
-      <w:r>
-        <w:rPr>
-          <w:rFonts w:eastAsia="Arial Unicode MS" w:ascii="Arial Unicode MS" w:hAnsi="Arial Unicode MS"/>
-        </w:rPr>
-        <w:t>任一环节失败，先说明原因，不要继续批量任务。</w:t>
-      </w:r>
-      <w:r>
-        <w:rPr>
-          <w:rFonts w:eastAsia="Arial Unicode MS" w:ascii="Arial Unicode MS" w:hAnsi="Arial Unicode MS"/>
-        </w:rPr>
-        <w:br/>
-      </w:r>
-      <w:r>
-        <w:rPr>
-          <w:rFonts w:eastAsia="Arial Unicode MS" w:ascii="Arial Unicode MS" w:hAnsi="Arial Unicode MS"/>
-        </w:rPr>
-        <w:br/>
-      </w:r>
-    </w:p>
-    <w:p>
-      <w:pPr/>
-      <w:r>
-        <w:rPr>
-          <w:rFonts w:eastAsia="Arial Unicode MS" w:ascii="Arial Unicode MS" w:hAnsi="Arial Unicode MS"/>
-        </w:rPr>
-        <w:t xml:space="preserve">检查结果时，关注三个细节：文件确实创建了；回读内容与指定文字一致；联网返回的是实际可访问的记录页。在本机模式下，还应能在 </w:t>
-      </w:r>
-      <w:r>
-        <w:rPr>
-          <w:rFonts w:ascii="Menlo" w:hAnsi="Menlo" w:eastAsia="Arial Unicode MS"/>
-          <w:sz w:val="18"/>
-        </w:rPr>
-        <w:t>literature_demo/_check/</w:t>
-      </w:r>
-      <w:r>
-        <w:rPr>
-          <w:rFonts w:eastAsia="Arial Unicode MS" w:ascii="Arial Unicode MS" w:hAnsi="Arial Unicode MS"/>
-        </w:rPr>
-        <w:t xml:space="preserve"> 里找到 hello.txt。</w:t>
-      </w:r>
-    </w:p>
-    <w:p>
-      <w:pPr/>
-      <w:r>
-        <w:rPr>
-          <w:rFonts w:eastAsia="Arial Unicode MS" w:ascii="Arial Unicode MS" w:hAnsi="Arial Unicode MS"/>
-        </w:rPr>
-        <w:t xml:space="preserve">如果模型只能回答文字，却没有工具执行记录，回到 </w:t>
-      </w:r>
-      <w:r>
-        <w:rPr>
-          <w:rFonts w:ascii="Menlo" w:hAnsi="Menlo" w:eastAsia="Arial Unicode MS"/>
-          <w:sz w:val="18"/>
-        </w:rPr>
-        <w:t>hermes tools</w:t>
-      </w:r>
-      <w:r>
-        <w:rPr>
-          <w:rFonts w:eastAsia="Arial Unicode MS" w:ascii="Arial Unicode MS" w:hAnsi="Arial Unicode MS"/>
-        </w:rPr>
-        <w:t xml:space="preserve"> 检查当前平台启用的工具，并重新启动对话。能搜索但不能保存，通常需要进一步检查文件工具、目录权限或后端位置。</w:t>
-      </w:r>
-    </w:p>
-    <w:p>
-      <w:pPr>
-        <w:pStyle w:val="Heading1"/>
-      </w:pPr>
-      <w:r>
-        <w:rPr>
-          <w:rFonts w:eastAsia="Arial Unicode MS" w:ascii="Arial Unicode MS" w:hAnsi="Arial Unicode MS"/>
-        </w:rPr>
-        <w:t>06 第一篇论文 从明确编号开始</w:t>
-      </w:r>
-    </w:p>
-    <w:p>
-      <w:pPr/>
-      <w:r>
-        <w:rPr>
-          <w:rFonts w:eastAsia="Arial Unicode MS" w:ascii="Arial Unicode MS" w:hAnsi="Arial Unicode MS"/>
-        </w:rPr>
-        <w:t xml:space="preserve">首次练习使用 arXiv 上的 </w:t>
-      </w:r>
-      <w:r>
-        <w:rPr>
-          <w:rFonts w:eastAsia="Arial Unicode MS" w:ascii="Arial Unicode MS" w:hAnsi="Arial Unicode MS"/>
-          <w:b/>
-        </w:rPr>
-        <w:t>Attention Is All You Need</w:t>
-      </w:r>
-      <w:r>
-        <w:rPr>
-          <w:rFonts w:eastAsia="Arial Unicode MS" w:ascii="Arial Unicode MS" w:hAnsi="Arial Unicode MS"/>
-        </w:rPr>
-        <w:t xml:space="preserve">，编号 </w:t>
-      </w:r>
-      <w:r>
-        <w:rPr>
-          <w:rFonts w:eastAsia="Arial Unicode MS" w:ascii="Arial Unicode MS" w:hAnsi="Arial Unicode MS"/>
-          <w:b/>
-        </w:rPr>
-        <w:t>1706.03762</w:t>
-      </w:r>
-      <w:r>
-        <w:rPr>
-          <w:rFonts w:eastAsia="Arial Unicode MS" w:ascii="Arial Unicode MS" w:hAnsi="Arial Unicode MS"/>
-        </w:rPr>
-        <w:t>。这篇练习只用于验证获取流程，无须先理解论文内容。</w:t>
-      </w:r>
-      <w:hyperlink r:id="rId21">
-        <w:r>
-          <w:rPr>
-            <w:color w:val="197B82"/>
-          </w:rPr>
-          <w:t>arXiv 官方记录页</w:t>
-        </w:r>
-      </w:hyperlink>
-    </w:p>
-    <w:p>
-      <w:pPr>
-        <w:pStyle w:val="Heading2"/>
-      </w:pPr>
-      <w:r>
-        <w:rPr>
-          <w:rFonts w:eastAsia="Arial Unicode MS" w:ascii="Arial Unicode MS" w:hAnsi="Arial Unicode MS"/>
-        </w:rPr>
-        <w:t>先知道在哪里核对</w:t>
-      </w:r>
-    </w:p>
-    <w:p>
-      <w:pPr/>
-      <w:r>
-        <w:rPr>
-          <w:rFonts w:eastAsia="Arial Unicode MS" w:ascii="Arial Unicode MS" w:hAnsi="Arial Unicode MS"/>
-        </w:rPr>
-        <w:t>打开记录页，核对题名和编号，再看全文区域中的 PDF 入口。arXiv 的编号可能带版本后缀；记录本次取得的具体版本，便于复查。</w:t>
       </w:r>
     </w:p>
     <w:p>
@@ -1434,8 +1205,8 @@
         </w:rPr>
         <w:drawing>
           <wp:inline xmlns:a="http://schemas.openxmlformats.org/drawingml/2006/main" xmlns:pic="http://schemas.openxmlformats.org/drawingml/2006/picture">
-            <wp:extent cx="3263428" cy="4663439"/>
-            <wp:docPr id="6" name="Picture 6" descr="图5 arXiv 页面题名和 PDF 入口的真实截图"/>
+            <wp:extent cx="3235569" cy="4206240"/>
+            <wp:docPr id="8" name="Picture 8" descr="图7 怎样判断检查完成"/>
             <wp:cNvGraphicFramePr>
               <a:graphicFrameLocks noChangeAspect="1"/>
             </wp:cNvGraphicFramePr>
@@ -1443,7 +1214,7 @@
               <a:graphicData uri="http://schemas.openxmlformats.org/drawingml/2006/picture">
                 <pic:pic>
                   <pic:nvPicPr>
-                    <pic:cNvPr id="0" name="05-arxiv.png"/>
+                    <pic:cNvPr id="0" name="19-check-result.png"/>
                     <pic:cNvPicPr/>
                   </pic:nvPicPr>
                   <pic:blipFill>
@@ -1455,7 +1226,7 @@
                   <pic:spPr>
                     <a:xfrm>
                       <a:off x="0" y="0"/>
-                      <a:ext cx="3263428" cy="4663439"/>
+                      <a:ext cx="3235569" cy="4206240"/>
                     </a:xfrm>
                     <a:prstGeom prst="rect"/>
                   </pic:spPr>
@@ -1474,22 +1245,163 @@
         <w:rPr>
           <w:rFonts w:eastAsia="Arial Unicode MS" w:ascii="Arial Unicode MS" w:hAnsi="Arial Unicode MS"/>
         </w:rPr>
-        <w:t>图5｜arXiv 官方页面的局部真实截图，截取日期为 2026 年 10 月 2 日。题名与全文入口分别放大展示；中文标签为阅读引导。页面布局可能随屏幕宽度变化。</w:t>
+        <w:t>图7｜验收对照图，不是 Hermes 已运行的结果截图。</w:t>
+      </w:r>
+    </w:p>
+    <w:p>
+      <w:pPr/>
+      <w:r>
+        <w:rPr>
+          <w:rFonts w:eastAsia="Arial Unicode MS" w:ascii="Arial Unicode MS" w:hAnsi="Arial Unicode MS"/>
+        </w:rPr>
+        <w:t xml:space="preserve">你应找到三项证据：实际目录；hello.txt 的写入与回读；实际访问的记录页和题名。本机还应能打开 </w:t>
+      </w:r>
+      <w:r>
+        <w:rPr>
+          <w:rFonts w:ascii="Menlo" w:hAnsi="Menlo" w:eastAsia="Arial Unicode MS"/>
+          <w:sz w:val="18"/>
+        </w:rPr>
+        <w:t>_check/hello.txt</w:t>
+      </w:r>
+      <w:r>
+        <w:rPr>
+          <w:rFonts w:eastAsia="Arial Unicode MS" w:ascii="Arial Unicode MS" w:hAnsi="Arial Unicode MS"/>
+        </w:rPr>
+        <w:t xml:space="preserve">。只有“检查通过”四个字时，要求补齐证据。能聊天却没有工具记录，回到 </w:t>
+      </w:r>
+      <w:r>
+        <w:rPr>
+          <w:rFonts w:ascii="Menlo" w:hAnsi="Menlo" w:eastAsia="Arial Unicode MS"/>
+          <w:sz w:val="18"/>
+        </w:rPr>
+        <w:t>hermes tools</w:t>
+      </w:r>
+      <w:r>
+        <w:rPr>
+          <w:rFonts w:eastAsia="Arial Unicode MS" w:ascii="Arial Unicode MS" w:hAnsi="Arial Unicode MS"/>
+        </w:rPr>
+        <w:t xml:space="preserve"> 检查当前平台。</w:t>
       </w:r>
     </w:p>
     <w:p>
       <w:pPr>
-        <w:pStyle w:val="Heading2"/>
+        <w:pStyle w:val="Heading1"/>
       </w:pPr>
       <w:r>
         <w:rPr>
           <w:rFonts w:eastAsia="Arial Unicode MS" w:ascii="Arial Unicode MS" w:hAnsi="Arial Unicode MS"/>
         </w:rPr>
-        <w:t>再把下载和记录一起交给 Hermes</w:t>
+        <w:t>06 下载第一篇，再自己打开验收</w:t>
       </w:r>
     </w:p>
     <w:p>
       <w:pPr/>
+      <w:r>
+        <w:rPr>
+          <w:rFonts w:eastAsia="Arial Unicode MS" w:ascii="Arial Unicode MS" w:hAnsi="Arial Unicode MS"/>
+        </w:rPr>
+        <w:t>练习文献：</w:t>
+      </w:r>
+      <w:r>
+        <w:rPr>
+          <w:rFonts w:eastAsia="Arial Unicode MS" w:ascii="Arial Unicode MS" w:hAnsi="Arial Unicode MS"/>
+          <w:b/>
+        </w:rPr>
+        <w:t>Attention Is All You Need</w:t>
+      </w:r>
+      <w:r>
+        <w:rPr>
+          <w:rFonts w:eastAsia="Arial Unicode MS" w:ascii="Arial Unicode MS" w:hAnsi="Arial Unicode MS"/>
+        </w:rPr>
+        <w:t xml:space="preserve">，arXiv </w:t>
+      </w:r>
+      <w:r>
+        <w:rPr>
+          <w:rFonts w:eastAsia="Arial Unicode MS" w:ascii="Arial Unicode MS" w:hAnsi="Arial Unicode MS"/>
+          <w:b/>
+        </w:rPr>
+        <w:t>1706.03762</w:t>
+      </w:r>
+      <w:r>
+        <w:rPr>
+          <w:rFonts w:eastAsia="Arial Unicode MS" w:ascii="Arial Unicode MS" w:hAnsi="Arial Unicode MS"/>
+        </w:rPr>
+        <w:t>。打开</w:t>
+      </w:r>
+      <w:hyperlink r:id="rId23">
+        <w:r>
+          <w:rPr>
+            <w:color w:val="197B82"/>
+          </w:rPr>
+          <w:t>官方记录页</w:t>
+        </w:r>
+      </w:hyperlink>
+      <w:r>
+        <w:rPr>
+          <w:rFonts w:eastAsia="Arial Unicode MS" w:ascii="Arial Unicode MS" w:hAnsi="Arial Unicode MS"/>
+        </w:rPr>
+        <w:t>，先核对题名和编号，再看 View PDF 入口；记录实际取得的版本。</w:t>
+      </w:r>
+    </w:p>
+    <w:p>
+      <w:pPr>
+        <w:keepNext/>
+        <w:spacing w:after="80"/>
+        <w:jc w:val="center"/>
+      </w:pPr>
+      <w:r>
+        <w:rPr>
+          <w:rFonts w:eastAsia="Arial Unicode MS" w:ascii="Arial Unicode MS" w:hAnsi="Arial Unicode MS"/>
+        </w:rPr>
+        <w:drawing>
+          <wp:inline xmlns:a="http://schemas.openxmlformats.org/drawingml/2006/main" xmlns:pic="http://schemas.openxmlformats.org/drawingml/2006/picture">
+            <wp:extent cx="2943484" cy="4206239"/>
+            <wp:docPr id="9" name="Picture 9" descr="图8 arXiv 题名与 PDF 入口"/>
+            <wp:cNvGraphicFramePr>
+              <a:graphicFrameLocks noChangeAspect="1"/>
+            </wp:cNvGraphicFramePr>
+            <a:graphic>
+              <a:graphicData uri="http://schemas.openxmlformats.org/drawingml/2006/picture">
+                <pic:pic>
+                  <pic:nvPicPr>
+                    <pic:cNvPr id="0" name="05-arxiv.png"/>
+                    <pic:cNvPicPr/>
+                  </pic:nvPicPr>
+                  <pic:blipFill>
+                    <a:blip r:embed="rId24"/>
+                    <a:stretch>
+                      <a:fillRect/>
+                    </a:stretch>
+                  </pic:blipFill>
+                  <pic:spPr>
+                    <a:xfrm>
+                      <a:off x="0" y="0"/>
+                      <a:ext cx="2943484" cy="4206239"/>
+                    </a:xfrm>
+                    <a:prstGeom prst="rect"/>
+                  </pic:spPr>
+                </pic:pic>
+              </a:graphicData>
+            </a:graphic>
+          </wp:inline>
+        </w:drawing>
+      </w:r>
+    </w:p>
+    <w:p>
+      <w:pPr>
+        <w:pStyle w:val="HermesCaption"/>
+      </w:pPr>
+      <w:r>
+        <w:rPr>
+          <w:rFonts w:eastAsia="Arial Unicode MS" w:ascii="Arial Unicode MS" w:hAnsi="Arial Unicode MS"/>
+        </w:rPr>
+        <w:t>图8｜arXiv 官方页面局部真实截图，2026 年 10 月 2 日匿名截取。中文标签为引导；页面布局可能变化。</w:t>
+      </w:r>
+    </w:p>
+    <w:p>
+      <w:pPr>
+        <w:keepNext/>
+      </w:pPr>
       <w:r>
         <w:rPr>
           <w:rFonts w:eastAsia="Arial Unicode MS" w:ascii="Arial Unicode MS" w:hAnsi="Arial Unicode MS"/>
@@ -1528,78 +1440,65 @@
           <w:rFonts w:eastAsia="Arial Unicode MS" w:ascii="Arial Unicode MS" w:hAnsi="Arial Unicode MS"/>
         </w:rPr>
         <w:br/>
+        <w:t xml:space="preserve">1. </w:t>
       </w:r>
       <w:r>
         <w:rPr>
           <w:rFonts w:eastAsia="Arial Unicode MS" w:ascii="Arial Unicode MS" w:hAnsi="Arial Unicode MS"/>
         </w:rPr>
-        <w:t xml:space="preserve">从 arXiv 官方记录页核对题名、作者、年份和当前可下载版本，使用页面实际提供的 PDF 入口。  </w:t>
+        <w:t xml:space="preserve">从官方记录页核对题名、作者、年份及当前可下载版本，使用页面实际 PDF 入口。  </w:t>
       </w:r>
       <w:r>
         <w:rPr>
           <w:rFonts w:eastAsia="Arial Unicode MS" w:ascii="Arial Unicode MS" w:hAnsi="Arial Unicode MS"/>
         </w:rPr>
         <w:br/>
+        <w:t xml:space="preserve">2. </w:t>
       </w:r>
       <w:r>
         <w:rPr>
           <w:rFonts w:eastAsia="Arial Unicode MS" w:ascii="Arial Unicode MS" w:hAnsi="Arial Unicode MS"/>
         </w:rPr>
-        <w:t xml:space="preserve">在当前工作目录创建 01_first_paper，将 PDF 实际保存到该文件夹。下载请求设置超时；每个来源最多重试两次。  </w:t>
+        <w:t xml:space="preserve">在当前工作目录新建 01_first_paper，实际保存 PDF；请求设超时，每个来源最多重试两次，不覆盖已有文件。  </w:t>
       </w:r>
       <w:r>
         <w:rPr>
           <w:rFonts w:eastAsia="Arial Unicode MS" w:ascii="Arial Unicode MS" w:hAnsi="Arial Unicode MS"/>
         </w:rPr>
         <w:br/>
+        <w:t xml:space="preserve">3. </w:t>
       </w:r>
       <w:r>
         <w:rPr>
           <w:rFonts w:eastAsia="Arial Unicode MS" w:ascii="Arial Unicode MS" w:hAnsi="Arial Unicode MS"/>
         </w:rPr>
-        <w:t xml:space="preserve">核验文件类型、能否打开、页数和首页题名。文件扩展名为 .pdf 或网页请求成功，都不能单独作为成功依据。  </w:t>
+        <w:t xml:space="preserve">核验文件类型、能否打开、页数和首页题名；扩展名或请求成功不能单独证明下载正确。  </w:t>
       </w:r>
       <w:r>
         <w:rPr>
           <w:rFonts w:eastAsia="Arial Unicode MS" w:ascii="Arial Unicode MS" w:hAnsi="Arial Unicode MS"/>
         </w:rPr>
         <w:br/>
+        <w:t xml:space="preserve">4. </w:t>
       </w:r>
       <w:r>
         <w:rPr>
           <w:rFonts w:eastAsia="Arial Unicode MS" w:ascii="Arial Unicode MS" w:hAnsi="Arial Unicode MS"/>
         </w:rPr>
-        <w:t xml:space="preserve">创建 manifest.csv，字段为 title、year、doi、arxiv_id、source_url、version、file_path、status、checked_at、note。未核实字段留空并解释。  </w:t>
+        <w:t xml:space="preserve">创建 manifest.csv，记录 title、year、doi、arxiv_id、source_url、version、file_path、status、checked_at、note。未核实字段留空并说明。  </w:t>
       </w:r>
       <w:r>
         <w:rPr>
           <w:rFonts w:eastAsia="Arial Unicode MS" w:ascii="Arial Unicode MS" w:hAnsi="Arial Unicode MS"/>
         </w:rPr>
         <w:br/>
+        <w:t xml:space="preserve">5. </w:t>
       </w:r>
       <w:r>
         <w:rPr>
           <w:rFonts w:eastAsia="Arial Unicode MS" w:ascii="Arial Unicode MS" w:hAnsi="Arial Unicode MS"/>
         </w:rPr>
-        <w:t xml:space="preserve">只有核验通过才将 status 写为 downloaded_verified；失败记录为 download_failed 或 verify_failed，并保留原因。  </w:t>
-      </w:r>
-      <w:r>
-        <w:rPr>
-          <w:rFonts w:eastAsia="Arial Unicode MS" w:ascii="Arial Unicode MS" w:hAnsi="Arial Unicode MS"/>
-        </w:rPr>
-        <w:br/>
-      </w:r>
-      <w:r>
-        <w:rPr>
-          <w:rFonts w:eastAsia="Arial Unicode MS" w:ascii="Arial Unicode MS" w:hAnsi="Arial Unicode MS"/>
-        </w:rPr>
-        <w:t>返回文件绝对路径、页数、来源、版本和状态。只操作本次新建文件夹，不覆盖已有文件。</w:t>
-      </w:r>
-      <w:r>
-        <w:rPr>
-          <w:rFonts w:eastAsia="Arial Unicode MS" w:ascii="Arial Unicode MS" w:hAnsi="Arial Unicode MS"/>
-        </w:rPr>
-        <w:br/>
+        <w:t>只有核验通过才记 downloaded_verified；失败记 download_failed 或 verify_failed 并保留原因。返回文件绝对路径、页数、来源、版本及状态。</w:t>
       </w:r>
       <w:r>
         <w:rPr>
@@ -1620,8 +1519,8 @@
         </w:rPr>
         <w:drawing>
           <wp:inline xmlns:a="http://schemas.openxmlformats.org/drawingml/2006/main" xmlns:pic="http://schemas.openxmlformats.org/drawingml/2006/picture">
-            <wp:extent cx="3142479" cy="4663439"/>
-            <wp:docPr id="7" name="Picture 7" descr="图6 单篇论文下载任务与完成标准"/>
+            <wp:extent cx="3017388" cy="4206239"/>
+            <wp:docPr id="10" name="Picture 10" descr="图9 下载后打开文件核对"/>
             <wp:cNvGraphicFramePr>
               <a:graphicFrameLocks noChangeAspect="1"/>
             </wp:cNvGraphicFramePr>
@@ -1629,11 +1528,11 @@
               <a:graphicData uri="http://schemas.openxmlformats.org/drawingml/2006/picture">
                 <pic:pic>
                   <pic:nvPicPr>
-                    <pic:cNvPr id="0" name="06-first-paper.png"/>
+                    <pic:cNvPr id="0" name="20-open-download.png"/>
                     <pic:cNvPicPr/>
                   </pic:nvPicPr>
                   <pic:blipFill>
-                    <a:blip r:embed="rId23"/>
+                    <a:blip r:embed="rId25"/>
                     <a:stretch>
                       <a:fillRect/>
                     </a:stretch>
@@ -1641,7 +1540,7 @@
                   <pic:spPr>
                     <a:xfrm>
                       <a:off x="0" y="0"/>
-                      <a:ext cx="3142479" cy="4663439"/>
+                      <a:ext cx="3017388" cy="4206239"/>
                     </a:xfrm>
                     <a:prstGeom prst="rect"/>
                   </pic:spPr>
@@ -1660,18 +1559,7 @@
         <w:rPr>
           <w:rFonts w:eastAsia="Arial Unicode MS" w:ascii="Arial Unicode MS" w:hAnsi="Arial Unicode MS"/>
         </w:rPr>
-        <w:t>图6｜任务步骤图。清单字段和状态名称是本文约定，并非 Hermes 内置固定输出。</w:t>
-      </w:r>
-    </w:p>
-    <w:p>
-      <w:pPr>
-        <w:pStyle w:val="Heading2"/>
-      </w:pPr>
-      <w:r>
-        <w:rPr>
-          <w:rFonts w:eastAsia="Arial Unicode MS" w:ascii="Arial Unicode MS" w:hAnsi="Arial Unicode MS"/>
-        </w:rPr>
-        <w:t>最后由你打开文件验收</w:t>
+        <w:t>图9｜文件验收指引，非实际下载结果。</w:t>
       </w:r>
     </w:p>
     <w:p>
@@ -1680,45 +1568,20 @@
         <w:rPr>
           <w:rFonts w:eastAsia="Arial Unicode MS" w:ascii="Arial Unicode MS" w:hAnsi="Arial Unicode MS"/>
         </w:rPr>
-        <w:t xml:space="preserve">在 </w:t>
+        <w:t>在实际输出目录找到 PDF，打开首页核对题名和作者，再看正文与参考文献；最后打开 manifest.csv，对照路径、来源和版本。</w:t>
       </w:r>
       <w:r>
         <w:rPr>
-          <w:rFonts w:ascii="Menlo" w:hAnsi="Menlo" w:eastAsia="Arial Unicode MS"/>
-          <w:sz w:val="18"/>
+          <w:rFonts w:eastAsia="Arial Unicode MS" w:ascii="Arial Unicode MS" w:hAnsi="Arial Unicode MS"/>
+          <w:b/>
         </w:rPr>
-        <w:t>literature_demo/01_first_paper/</w:t>
+        <w:t>文件与清单应互相对应。</w:t>
       </w:r>
       <w:r>
         <w:rPr>
           <w:rFonts w:eastAsia="Arial Unicode MS" w:ascii="Arial Unicode MS" w:hAnsi="Arial Unicode MS"/>
         </w:rPr>
-        <w:t xml:space="preserve"> 找到 PDF，双击打开，再打开 manifest.csv。确认文件能看、首页题名正确、清单有来源和对应路径。</w:t>
-      </w:r>
-    </w:p>
-    <w:p>
-      <w:pPr/>
-      <w:r>
-        <w:rPr>
-          <w:rFonts w:eastAsia="Arial Unicode MS" w:ascii="Arial Unicode MS" w:hAnsi="Arial Unicode MS"/>
-        </w:rPr>
-        <w:t>此时可以给 Hermes 追加一句：“请列出本次生成的文件及大小，并报告 PDF 与 manifest.csv 是否对应。” 文件大小可以帮助发现异常，但没有一个通用大小阈值能证明 PDF 一定正确。</w:t>
-      </w:r>
-    </w:p>
-    <w:p>
-      <w:pPr/>
-      <w:r>
-        <w:rPr>
-          <w:rFonts w:eastAsia="Arial Unicode MS" w:ascii="Arial Unicode MS" w:hAnsi="Arial Unicode MS"/>
-          <w:b/>
-        </w:rPr>
-        <w:t>如果只得到论文链接，补充这句：</w:t>
-      </w:r>
-      <w:r>
-        <w:rPr>
-          <w:rFonts w:eastAsia="Arial Unicode MS" w:ascii="Arial Unicode MS" w:hAnsi="Arial Unicode MS"/>
-        </w:rPr>
-        <w:t>“请把全文实际保存到文件夹并重新核验；若保存失败，返回失败原因和需要我处理的步骤。”</w:t>
+        <w:t xml:space="preserve"> 只返回链接时，追加：“请把全文实际保存到文件夹并核验；失败则说明原因和下一步。”</w:t>
       </w:r>
     </w:p>
     <w:p>
@@ -1729,7 +1592,7 @@
         <w:rPr>
           <w:rFonts w:eastAsia="Arial Unicode MS" w:ascii="Arial Unicode MS" w:hAnsi="Arial Unicode MS"/>
         </w:rPr>
-        <w:t>07 医学文献 用 PMID 找记录 再找全文</w:t>
+        <w:t>07 医学文献：题录与全文分开获取</w:t>
       </w:r>
     </w:p>
     <w:p>
@@ -1738,21 +1601,21 @@
         <w:rPr>
           <w:rFonts w:eastAsia="Arial Unicode MS" w:ascii="Arial Unicode MS" w:hAnsi="Arial Unicode MS"/>
         </w:rPr>
-        <w:t>医学读者常从 PubMed 开始。PubMed 主要提供题录、摘要和全文链接，全文通常要到 PMC、期刊官网或其他提供方取得。</w:t>
+        <w:t>PubMed 提供题录、摘要和全文链接；全文通常来自 PMC、期刊或其他提供方。</w:t>
       </w:r>
       <w:r>
         <w:rPr>
           <w:rFonts w:eastAsia="Arial Unicode MS" w:ascii="Arial Unicode MS" w:hAnsi="Arial Unicode MS"/>
           <w:b/>
         </w:rPr>
-        <w:t>PubMed 记录页本身不能当作论文全文 PDF。</w:t>
+        <w:t>PubMed 记录页不能当作全文 PDF。</w:t>
       </w:r>
-      <w:hyperlink r:id="rId24">
+      <w:hyperlink r:id="rId26">
         <w:r>
           <w:rPr>
             <w:color w:val="197B82"/>
           </w:rPr>
-          <w:t>PubMed 全文获取说明</w:t>
+          <w:t>PubMed 全文说明</w:t>
         </w:r>
       </w:hyperlink>
     </w:p>
@@ -1762,7 +1625,7 @@
         <w:rPr>
           <w:rFonts w:eastAsia="Arial Unicode MS" w:ascii="Arial Unicode MS" w:hAnsi="Arial Unicode MS"/>
         </w:rPr>
-        <w:t xml:space="preserve">以 </w:t>
+        <w:t>练习例：</w:t>
       </w:r>
       <w:r>
         <w:rPr>
@@ -1775,7 +1638,7 @@
         <w:rPr>
           <w:rFonts w:eastAsia="Arial Unicode MS" w:ascii="Arial Unicode MS" w:hAnsi="Arial Unicode MS"/>
         </w:rPr>
-        <w:t xml:space="preserve"> 为练习：作者 Neal S. Young，2018 年发表，PMID </w:t>
+        <w:t xml:space="preserve">，Neal S. Young，2018；PMID </w:t>
       </w:r>
       <w:r>
         <w:rPr>
@@ -1801,7 +1664,7 @@
         <w:rPr>
           <w:rFonts w:eastAsia="Arial Unicode MS" w:ascii="Arial Unicode MS" w:hAnsi="Arial Unicode MS"/>
         </w:rPr>
-        <w:t xml:space="preserve">，对应 PMCID </w:t>
+        <w:t xml:space="preserve">，PMCID </w:t>
       </w:r>
       <w:r>
         <w:rPr>
@@ -1814,14 +1677,14 @@
         <w:rPr>
           <w:rFonts w:eastAsia="Arial Unicode MS" w:ascii="Arial Unicode MS" w:hAnsi="Arial Unicode MS"/>
         </w:rPr>
-        <w:t>。这些信息已经在公开题录中核对；本例仅演示获取路径。</w:t>
+        <w:t>。</w:t>
       </w:r>
-      <w:hyperlink r:id="rId25">
+      <w:hyperlink r:id="rId27">
         <w:r>
           <w:rPr>
             <w:color w:val="197B82"/>
           </w:rPr>
-          <w:t>示例的 PubMed 记录</w:t>
+          <w:t>示例题录</w:t>
         </w:r>
       </w:hyperlink>
     </w:p>
@@ -1837,8 +1700,8 @@
         </w:rPr>
         <w:drawing>
           <wp:inline xmlns:a="http://schemas.openxmlformats.org/drawingml/2006/main" xmlns:pic="http://schemas.openxmlformats.org/drawingml/2006/picture">
-            <wp:extent cx="2664822" cy="4663438"/>
-            <wp:docPr id="8" name="Picture 8" descr="图7 医学文献题录与全文入口核对卡"/>
+            <wp:extent cx="2403565" cy="4206239"/>
+            <wp:docPr id="11" name="Picture 11" descr="图10 医学题录核对卡"/>
             <wp:cNvGraphicFramePr>
               <a:graphicFrameLocks noChangeAspect="1"/>
             </wp:cNvGraphicFramePr>
@@ -1850,7 +1713,7 @@
                     <pic:cNvPicPr/>
                   </pic:nvPicPr>
                   <pic:blipFill>
-                    <a:blip r:embed="rId26"/>
+                    <a:blip r:embed="rId28"/>
                     <a:stretch>
                       <a:fillRect/>
                     </a:stretch>
@@ -1858,7 +1721,7 @@
                   <pic:spPr>
                     <a:xfrm>
                       <a:off x="0" y="0"/>
-                      <a:ext cx="2664822" cy="4663438"/>
+                      <a:ext cx="2403565" cy="4206239"/>
                     </a:xfrm>
                     <a:prstGeom prst="rect"/>
                   </pic:spPr>
@@ -1877,27 +1740,13 @@
         <w:rPr>
           <w:rFonts w:eastAsia="Arial Unicode MS" w:ascii="Arial Unicode MS" w:hAnsi="Arial Unicode MS"/>
         </w:rPr>
-        <w:t>图7｜根据 PubMed 官方记录核对的题录指令卡，不是软件截图。看清 PMID、DOI、PMCID，再使用记录页的 Full text links 判断全文入口。</w:t>
+        <w:t>图10｜依据 PubMed 官方记录制作的题录卡，非软件截图。手动查看 Full text links，再核对全文版本。</w:t>
       </w:r>
     </w:p>
     <w:p>
-      <w:pPr/>
-      <w:r>
-        <w:rPr>
-          <w:rFonts w:eastAsia="Arial Unicode MS" w:ascii="Arial Unicode MS" w:hAnsi="Arial Unicode MS"/>
-          <w:b/>
-        </w:rPr>
-        <w:t>手动核对时这样做：</w:t>
-      </w:r>
-      <w:r>
-        <w:rPr>
-          <w:rFonts w:eastAsia="Arial Unicode MS" w:ascii="Arial Unicode MS" w:hAnsi="Arial Unicode MS"/>
-        </w:rPr>
-        <w:t xml:space="preserve"> 打开 PubMed，输入 PMID；在记录页核对题名与标识符；查看 Full text links。若有 PMC 入口，可进入全文页面核对稿件类型。期刊官网入口也可能需要机构订阅。</w:t>
-      </w:r>
-    </w:p>
-    <w:p>
-      <w:pPr/>
+      <w:pPr>
+        <w:keepNext/>
+      </w:pPr>
       <w:r>
         <w:rPr>
           <w:rFonts w:eastAsia="Arial Unicode MS" w:ascii="Arial Unicode MS" w:hAnsi="Arial Unicode MS"/>
@@ -1936,12 +1785,65 @@
           <w:rFonts w:eastAsia="Arial Unicode MS" w:ascii="Arial Unicode MS" w:hAnsi="Arial Unicode MS"/>
         </w:rPr>
         <w:br/>
+        <w:t xml:space="preserve">1. </w:t>
       </w:r>
       <w:r>
         <w:rPr>
           <w:rFonts w:eastAsia="Arial Unicode MS" w:ascii="Arial Unicode MS" w:hAnsi="Arial Unicode MS"/>
         </w:rPr>
-        <w:t xml:space="preserve">先在 PubMed 核对题名、作者、年份、DOI 和 PMCID，报告是否与输入对应。  </w:t>
+        <w:t xml:space="preserve">在 PubMed 核对题名、作者、年份、DOI 和 PMCID，确认与输入对应。  </w:t>
+      </w:r>
+      <w:r>
+        <w:rPr>
+          <w:rFonts w:eastAsia="Arial Unicode MS" w:ascii="Arial Unicode MS" w:hAnsi="Arial Unicode MS"/>
+        </w:rPr>
+        <w:br/>
+        <w:t xml:space="preserve">2. </w:t>
+      </w:r>
+      <w:r>
+        <w:rPr>
+          <w:rFonts w:eastAsia="Arial Unicode MS" w:ascii="Arial Unicode MS" w:hAnsi="Arial Unicode MS"/>
+        </w:rPr>
+        <w:t xml:space="preserve">查找合法全文，核对期刊官网和公开仓储；注明发表版、作者接受稿或其他版本。  </w:t>
+      </w:r>
+      <w:r>
+        <w:rPr>
+          <w:rFonts w:eastAsia="Arial Unicode MS" w:ascii="Arial Unicode MS" w:hAnsi="Arial Unicode MS"/>
+        </w:rPr>
+        <w:br/>
+        <w:t xml:space="preserve">3. </w:t>
+      </w:r>
+      <w:r>
+        <w:rPr>
+          <w:rFonts w:eastAsia="Arial Unicode MS" w:ascii="Arial Unicode MS" w:hAnsi="Arial Unicode MS"/>
+        </w:rPr>
+        <w:t xml:space="preserve">从 PMC 自动获取时，先查当前开发者及 Article Datasets 文档，使用允许的服务；不要循环抓取网页或沿用停用的旧 OA Web Service。  </w:t>
+      </w:r>
+      <w:r>
+        <w:rPr>
+          <w:rFonts w:eastAsia="Arial Unicode MS" w:ascii="Arial Unicode MS" w:hAnsi="Arial Unicode MS"/>
+        </w:rPr>
+        <w:br/>
+        <w:t xml:space="preserve">4. </w:t>
+      </w:r>
+      <w:r>
+        <w:rPr>
+          <w:rFonts w:eastAsia="Arial Unicode MS" w:ascii="Arial Unicode MS" w:hAnsi="Arial Unicode MS"/>
+        </w:rPr>
+        <w:t xml:space="preserve">新建 02_medical_example，能取得 PDF 就保存核验；只有 HTML、XML 或 TXT 全文时保留真实格式，记 fulltext_other。  </w:t>
+      </w:r>
+      <w:r>
+        <w:rPr>
+          <w:rFonts w:eastAsia="Arial Unicode MS" w:ascii="Arial Unicode MS" w:hAnsi="Arial Unicode MS"/>
+        </w:rPr>
+        <w:br/>
+        <w:t xml:space="preserve">5. </w:t>
+      </w:r>
+      <w:r>
+        <w:rPr>
+          <w:rFonts w:eastAsia="Arial Unicode MS" w:ascii="Arial Unicode MS" w:hAnsi="Arial Unicode MS"/>
+        </w:rPr>
+        <w:t>将题录、来源、版本、路径、时间和状态写入 manifest.csv；不能取得时记录 needs_access、not_found 或 download_failed 及下一步。不得用摘要替代全文。</w:t>
       </w:r>
       <w:r>
         <w:rPr>
@@ -1949,71 +1851,152 @@
         </w:rPr>
         <w:br/>
       </w:r>
+    </w:p>
+    <w:p>
+      <w:pPr/>
       <w:r>
         <w:rPr>
           <w:rFonts w:eastAsia="Arial Unicode MS" w:ascii="Arial Unicode MS" w:hAnsi="Arial Unicode MS"/>
+          <w:b/>
         </w:rPr>
-        <w:t xml:space="preserve">查找能够合法获取的全文来源，优先核对期刊官网和公开仓储。标明取得的是发表版、作者接受稿还是其他版本。  </w:t>
+        <w:t>PMC 的旧分发路线已调整。</w:t>
       </w:r>
       <w:r>
         <w:rPr>
           <w:rFonts w:eastAsia="Arial Unicode MS" w:ascii="Arial Unicode MS" w:hAnsi="Arial Unicode MS"/>
         </w:rPr>
-        <w:br/>
+        <w:t xml:space="preserve"> 2026 年 8 月完成 Article Dataset 调整，旧版数据文件已移除。自动获取参考当前允许的 Cloud Service、OAI-PMH、E-Utilities、BioC 等服务；需要 PDF 时核对 Cloud 数据集是否提供该文件，并非每篇都有 PDF。</w:t>
+      </w:r>
+      <w:hyperlink r:id="rId29">
+        <w:r>
+          <w:rPr>
+            <w:color w:val="197B82"/>
+          </w:rPr>
+          <w:t>PMC 数据集</w:t>
+        </w:r>
+      </w:hyperlink>
+      <w:r>
+        <w:rPr>
+          <w:rFonts w:eastAsia="Arial Unicode MS" w:ascii="Arial Unicode MS" w:hAnsi="Arial Unicode MS"/>
+        </w:rPr>
+        <w:t>、</w:t>
+      </w:r>
+      <w:hyperlink r:id="rId30">
+        <w:r>
+          <w:rPr>
+            <w:color w:val="197B82"/>
+          </w:rPr>
+          <w:t>开发者说明</w:t>
+        </w:r>
+      </w:hyperlink>
+      <w:r>
+        <w:rPr>
+          <w:rFonts w:eastAsia="Arial Unicode MS" w:ascii="Arial Unicode MS" w:hAnsi="Arial Unicode MS"/>
+        </w:rPr>
+        <w:t>、</w:t>
+      </w:r>
+      <w:hyperlink r:id="rId31">
+        <w:r>
+          <w:rPr>
+            <w:color w:val="197B82"/>
+          </w:rPr>
+          <w:t>Cloud Service</w:t>
+        </w:r>
+      </w:hyperlink>
+    </w:p>
+    <w:p>
+      <w:pPr/>
+      <w:r>
+        <w:rPr>
+          <w:rFonts w:eastAsia="Arial Unicode MS" w:ascii="Arial Unicode MS" w:hAnsi="Arial Unicode MS"/>
+        </w:rPr>
+        <w:t xml:space="preserve">有 DOI 可用 </w:t>
+      </w:r>
+      <w:hyperlink r:id="rId32">
+        <w:r>
+          <w:rPr>
+            <w:color w:val="197B82"/>
+          </w:rPr>
+          <w:t>Unpaywall</w:t>
+        </w:r>
+      </w:hyperlink>
+      <w:r>
+        <w:rPr>
+          <w:rFonts w:eastAsia="Arial Unicode MS" w:ascii="Arial Unicode MS" w:hAnsi="Arial Unicode MS"/>
+        </w:rPr>
+        <w:t xml:space="preserve"> 查开放位置和版本，PDF 链接可能为空。订阅文献使用医院或学校正式入口；需要人工获取的项目留在清单中。</w:t>
+      </w:r>
+    </w:p>
+    <w:p>
+      <w:pPr>
+        <w:pStyle w:val="Heading1"/>
+      </w:pPr>
+      <w:r>
+        <w:rPr>
+          <w:rFonts w:eastAsia="Arial Unicode MS" w:ascii="Arial Unicode MS" w:hAnsi="Arial Unicode MS"/>
+        </w:rPr>
+        <w:t>08 用 CSV 练习去重和小批下载</w:t>
+      </w:r>
+    </w:p>
+    <w:p>
+      <w:pPr/>
+      <w:r>
+        <w:rPr>
+          <w:rFonts w:eastAsia="Arial Unicode MS" w:ascii="Arial Unicode MS" w:hAnsi="Arial Unicode MS"/>
+        </w:rPr>
+        <w:t xml:space="preserve">Excel 新建 </w:t>
+      </w:r>
+      <w:r>
+        <w:rPr>
+          <w:rFonts w:ascii="Menlo" w:hAnsi="Menlo" w:eastAsia="Arial Unicode MS"/>
+          <w:sz w:val="18"/>
+        </w:rPr>
+        <w:t>title</w:t>
       </w:r>
       <w:r>
         <w:rPr>
           <w:rFonts w:eastAsia="Arial Unicode MS" w:ascii="Arial Unicode MS" w:hAnsi="Arial Unicode MS"/>
         </w:rPr>
-        <w:t xml:space="preserve">如果从 PMC 自动获取内容，先读取当前 PMC 官方开发者和 Article Datasets 文档，使用允许的自动获取服务。不要把批量任务写成网页循环抓取，也不要沿用已停用的旧 OA Web Service。  </w:t>
+        <w:t>、</w:t>
+      </w:r>
+      <w:r>
+        <w:rPr>
+          <w:rFonts w:ascii="Menlo" w:hAnsi="Menlo" w:eastAsia="Arial Unicode MS"/>
+          <w:sz w:val="18"/>
+        </w:rPr>
+        <w:t>doi</w:t>
       </w:r>
       <w:r>
         <w:rPr>
           <w:rFonts w:eastAsia="Arial Unicode MS" w:ascii="Arial Unicode MS" w:hAnsi="Arial Unicode MS"/>
         </w:rPr>
-        <w:br/>
+        <w:t>、</w:t>
+      </w:r>
+      <w:r>
+        <w:rPr>
+          <w:rFonts w:ascii="Menlo" w:hAnsi="Menlo" w:eastAsia="Arial Unicode MS"/>
+          <w:sz w:val="18"/>
+        </w:rPr>
+        <w:t>pmid</w:t>
       </w:r>
       <w:r>
         <w:rPr>
           <w:rFonts w:eastAsia="Arial Unicode MS" w:ascii="Arial Unicode MS" w:hAnsi="Arial Unicode MS"/>
         </w:rPr>
-        <w:t xml:space="preserve">在当前工作目录创建 02_medical_example。能取得 PDF 就保存并核验；只有 HTML、XML 或 TXT 全文时，保留真实格式并标记 fulltext_other。  </w:t>
+        <w:t xml:space="preserve"> 三列，每行一篇，空字段留空，保存为“CSV UTF-8”。不合并单元格；题名有英文逗号需正确使用 CSV 引号。初次直接用素材包的 </w:t>
+      </w:r>
+      <w:r>
+        <w:rPr>
+          <w:rFonts w:ascii="Menlo" w:hAnsi="Menlo" w:eastAsia="Arial Unicode MS"/>
+          <w:sz w:val="18"/>
+        </w:rPr>
+        <w:t>papers.csv</w:t>
       </w:r>
       <w:r>
         <w:rPr>
           <w:rFonts w:eastAsia="Arial Unicode MS" w:ascii="Arial Unicode MS" w:hAnsi="Arial Unicode MS"/>
         </w:rPr>
-        <w:br/>
-      </w:r>
-      <w:r>
-        <w:rPr>
-          <w:rFonts w:eastAsia="Arial Unicode MS" w:ascii="Arial Unicode MS" w:hAnsi="Arial Unicode MS"/>
-        </w:rPr>
-        <w:t xml:space="preserve">将题录、来源、版本、路径、获取时间和状态写入 manifest.csv。不能取得全文时，标记 needs_access、not_found 或 download_failed，并给出下一步。  </w:t>
-      </w:r>
-      <w:r>
-        <w:rPr>
-          <w:rFonts w:eastAsia="Arial Unicode MS" w:ascii="Arial Unicode MS" w:hAnsi="Arial Unicode MS"/>
-        </w:rPr>
-        <w:br/>
-      </w:r>
-      <w:r>
-        <w:rPr>
-          <w:rFonts w:eastAsia="Arial Unicode MS" w:ascii="Arial Unicode MS" w:hAnsi="Arial Unicode MS"/>
-        </w:rPr>
-        <w:t>返回结果和文件路径；不得用摘要替代全文，不得将网页文件改名为 PDF。</w:t>
-      </w:r>
-      <w:r>
-        <w:rPr>
-          <w:rFonts w:eastAsia="Arial Unicode MS" w:ascii="Arial Unicode MS" w:hAnsi="Arial Unicode MS"/>
-        </w:rPr>
-        <w:br/>
-      </w:r>
-      <w:r>
-        <w:rPr>
-          <w:rFonts w:eastAsia="Arial Unicode MS" w:ascii="Arial Unicode MS" w:hAnsi="Arial Unicode MS"/>
-        </w:rPr>
-        <w:br/>
+        <w:t>，放入工作目录即可。</w:t>
       </w:r>
     </w:p>
     <w:p>
@@ -2028,8 +2011,8 @@
         </w:rPr>
         <w:drawing>
           <wp:inline xmlns:a="http://schemas.openxmlformats.org/drawingml/2006/main" xmlns:pic="http://schemas.openxmlformats.org/drawingml/2006/picture">
-            <wp:extent cx="2911011" cy="4663440"/>
-            <wp:docPr id="9" name="Picture 9" descr="图8 从题录到全文的获取路径"/>
+            <wp:extent cx="2650434" cy="4206239"/>
+            <wp:docPr id="12" name="Picture 12" descr="图11 准备清单"/>
             <wp:cNvGraphicFramePr>
               <a:graphicFrameLocks noChangeAspect="1"/>
             </wp:cNvGraphicFramePr>
@@ -2037,11 +2020,11 @@
               <a:graphicData uri="http://schemas.openxmlformats.org/drawingml/2006/picture">
                 <pic:pic>
                   <pic:nvPicPr>
-                    <pic:cNvPr id="0" name="08-fulltext.png"/>
+                    <pic:cNvPr id="0" name="21-csv-workflow.png"/>
                     <pic:cNvPicPr/>
                   </pic:nvPicPr>
                   <pic:blipFill>
-                    <a:blip r:embed="rId27"/>
+                    <a:blip r:embed="rId33"/>
                     <a:stretch>
                       <a:fillRect/>
                     </a:stretch>
@@ -2049,7 +2032,7 @@
                   <pic:spPr>
                     <a:xfrm>
                       <a:off x="0" y="0"/>
-                      <a:ext cx="2911011" cy="4663440"/>
+                      <a:ext cx="2650434" cy="4206239"/>
                     </a:xfrm>
                     <a:prstGeom prst="rect"/>
                   </pic:spPr>
@@ -2068,122 +2051,7 @@
         <w:rPr>
           <w:rFonts w:eastAsia="Arial Unicode MS" w:ascii="Arial Unicode MS" w:hAnsi="Arial Unicode MS"/>
         </w:rPr>
-        <w:t>图8｜全文获取路径图。题录定位、访问权限和文件格式分别检查。</w:t>
-      </w:r>
-    </w:p>
-    <w:p>
-      <w:pPr/>
-      <w:r>
-        <w:rPr>
-          <w:rFonts w:eastAsia="Arial Unicode MS" w:ascii="Arial Unicode MS" w:hAnsi="Arial Unicode MS"/>
-          <w:b/>
-        </w:rPr>
-        <w:t>PMC 路线有一项时间变化需要记住。</w:t>
-      </w:r>
-      <w:r>
-        <w:rPr>
-          <w:rFonts w:eastAsia="Arial Unicode MS" w:ascii="Arial Unicode MS" w:hAnsi="Arial Unicode MS"/>
-        </w:rPr>
-        <w:t xml:space="preserve"> 2026 年 8 月，PMC 完成 Article Dataset 分发服务调整，旧版数据文件已移除。当前自动获取应参考官方开发者文档，使用 PMC Cloud Service、OAI-PMH、E-Utilities 或 BioC 等允许的服务。需要数据集中的 PDF 时，查看 Cloud Service 是否提供该文件；并非所有全文或作者手稿都有可获取的 PDF。</w:t>
-      </w:r>
-      <w:hyperlink r:id="rId28">
-        <w:r>
-          <w:rPr>
-            <w:color w:val="197B82"/>
-          </w:rPr>
-          <w:t>PMC 数据集更新与格式说明</w:t>
-        </w:r>
-      </w:hyperlink>
-      <w:r>
-        <w:rPr>
-          <w:rFonts w:eastAsia="Arial Unicode MS" w:ascii="Arial Unicode MS" w:hAnsi="Arial Unicode MS"/>
-        </w:rPr>
-        <w:t>、</w:t>
-      </w:r>
-      <w:hyperlink r:id="rId29">
-        <w:r>
-          <w:rPr>
-            <w:color w:val="197B82"/>
-          </w:rPr>
-          <w:t>当前自动获取说明</w:t>
-        </w:r>
-      </w:hyperlink>
-      <w:r>
-        <w:rPr>
-          <w:rFonts w:eastAsia="Arial Unicode MS" w:ascii="Arial Unicode MS" w:hAnsi="Arial Unicode MS"/>
-        </w:rPr>
-        <w:t>、</w:t>
-      </w:r>
-      <w:hyperlink r:id="rId30">
-        <w:r>
-          <w:rPr>
-            <w:color w:val="197B82"/>
-          </w:rPr>
-          <w:t>Cloud Service 文件说明</w:t>
-        </w:r>
-      </w:hyperlink>
-    </w:p>
-    <w:p>
-      <w:pPr/>
-      <w:r>
-        <w:rPr>
-          <w:rFonts w:eastAsia="Arial Unicode MS" w:ascii="Arial Unicode MS" w:hAnsi="Arial Unicode MS"/>
-        </w:rPr>
-        <w:t xml:space="preserve">如果已有 DOI，还可以将 </w:t>
-      </w:r>
-      <w:r>
-        <w:rPr>
-          <w:rFonts w:eastAsia="Arial Unicode MS" w:ascii="Arial Unicode MS" w:hAnsi="Arial Unicode MS"/>
-          <w:b/>
-        </w:rPr>
-        <w:t>Unpaywall</w:t>
-      </w:r>
-      <w:r>
-        <w:rPr>
-          <w:rFonts w:eastAsia="Arial Unicode MS" w:ascii="Arial Unicode MS" w:hAnsi="Arial Unicode MS"/>
-        </w:rPr>
-        <w:t xml:space="preserve"> 作为开放全文线索。它提供开放位置、PDF 链接、版本等字段；查到开放位置后，仍需实际打开和核验。</w:t>
-      </w:r>
-      <w:r>
-        <w:rPr>
-          <w:rFonts w:ascii="Menlo" w:hAnsi="Menlo" w:eastAsia="Arial Unicode MS"/>
-          <w:sz w:val="18"/>
-        </w:rPr>
-        <w:t>url_for_pdf</w:t>
-      </w:r>
-      <w:r>
-        <w:rPr>
-          <w:rFonts w:eastAsia="Arial Unicode MS" w:ascii="Arial Unicode MS" w:hAnsi="Arial Unicode MS"/>
-        </w:rPr>
-        <w:t xml:space="preserve"> 可能为空，公开页面可读也不等于可以任意转发原文。</w:t>
-      </w:r>
-      <w:hyperlink r:id="rId31">
-        <w:r>
-          <w:rPr>
-            <w:color w:val="197B82"/>
-          </w:rPr>
-          <w:t>Unpaywall 数据字段说明</w:t>
-        </w:r>
-      </w:hyperlink>
-    </w:p>
-    <w:p>
-      <w:pPr/>
-      <w:r>
-        <w:rPr>
-          <w:rFonts w:eastAsia="Arial Unicode MS" w:ascii="Arial Unicode MS" w:hAnsi="Arial Unicode MS"/>
-        </w:rPr>
-        <w:t>需要医院或学校订阅时，通过机构提供的正式入口获取；把需要人工处理的项目留在清单中。这类情况的任务成果，是明确访问状态和下一步，而不是反复请求同一个登录页。</w:t>
-      </w:r>
-    </w:p>
-    <w:p>
-      <w:pPr>
-        <w:pStyle w:val="Heading1"/>
-      </w:pPr>
-      <w:r>
-        <w:rPr>
-          <w:rFonts w:eastAsia="Arial Unicode MS" w:ascii="Arial Unicode MS" w:hAnsi="Arial Unicode MS"/>
-        </w:rPr>
-        <w:t>08 清单下载 先清洗 再小批量获取</w:t>
+        <w:t>图11｜CSV 准备指引，非 Excel 截图。字段标题不计为论文。</w:t>
       </w:r>
     </w:p>
     <w:p>
@@ -2192,16 +2060,7 @@
         <w:rPr>
           <w:rFonts w:eastAsia="Arial Unicode MS" w:ascii="Arial Unicode MS" w:hAnsi="Arial Unicode MS"/>
         </w:rPr>
-        <w:t>第一篇跑通后，再尝试已有文献清单。最容易上手的输入是 UTF-8 编码的 CSV：第一行是字段名，每行一条记录，尽量提供 DOI 或 PMID。</w:t>
-      </w:r>
-    </w:p>
-    <w:p>
-      <w:pPr/>
-      <w:r>
-        <w:rPr>
-          <w:rFonts w:eastAsia="Arial Unicode MS" w:ascii="Arial Unicode MS" w:hAnsi="Arial Unicode MS"/>
-        </w:rPr>
-        <w:t>下面是一份可以直接练习的三行清单。最后两行故意对应同一篇论文，用来观察 Hermes 是否能识别重复记录。</w:t>
+        <w:t>练习文件内容如下，三条数据对应两篇文献：</w:t>
       </w:r>
     </w:p>
     <w:p>
@@ -2224,38 +2083,41 @@
       </w:r>
     </w:p>
     <w:p>
-      <w:pPr/>
+      <w:pPr>
+        <w:keepNext/>
+      </w:pPr>
+      <w:r>
+        <w:rPr>
+          <w:rFonts w:eastAsia="Arial Unicode MS" w:ascii="Arial Unicode MS" w:hAnsi="Arial Unicode MS"/>
+          <w:b/>
+        </w:rPr>
+        <w:t>先检查，不下载：</w:t>
+      </w:r>
+    </w:p>
+    <w:p>
+      <w:pPr>
+        <w:pStyle w:val="HermesPrompt"/>
+        <w:keepLines/>
+        <w:shd w:fill="EDF7F3"/>
+        <w:ind w:left="173" w:right="173"/>
+      </w:pPr>
       <w:r>
         <w:rPr>
           <w:rFonts w:eastAsia="Arial Unicode MS" w:ascii="Arial Unicode MS" w:hAnsi="Arial Unicode MS"/>
         </w:rPr>
-        <w:t xml:space="preserve">保存为 </w:t>
-      </w:r>
-      <w:r>
-        <w:rPr>
-          <w:rFonts w:ascii="Menlo" w:hAnsi="Menlo" w:eastAsia="Arial Unicode MS"/>
-          <w:sz w:val="18"/>
-        </w:rPr>
-        <w:t>papers.csv</w:t>
+        <w:br/>
       </w:r>
       <w:r>
         <w:rPr>
           <w:rFonts w:eastAsia="Arial Unicode MS" w:ascii="Arial Unicode MS" w:hAnsi="Arial Unicode MS"/>
         </w:rPr>
-        <w:t xml:space="preserve">，放在 </w:t>
-      </w:r>
-      <w:r>
-        <w:rPr>
-          <w:rFonts w:ascii="Menlo" w:hAnsi="Menlo" w:eastAsia="Arial Unicode MS"/>
-          <w:sz w:val="18"/>
-        </w:rPr>
-        <w:t>literature_demo</w:t>
+        <w:t>请读取当前工作目录的 papers.csv，先不要下载。检查字段、数据行数和空值；规范化 DOI，按 DOI、PMID 与实际题录对应关系去重。仅题名相似的项目不能直接合并。输出 input_checked.csv，保留每条输入行号、处理结果和核对依据；不要补造编号。返回原始行数、重复映射、唯一文献数及待确认项。</w:t>
       </w:r>
       <w:r>
         <w:rPr>
           <w:rFonts w:eastAsia="Arial Unicode MS" w:ascii="Arial Unicode MS" w:hAnsi="Arial Unicode MS"/>
         </w:rPr>
-        <w:t xml:space="preserve"> 文件夹。也可以从配套素材包取用。Excel 用户可以选择“CSV UTF-8”格式；准备自己的数据时，题名里有英文逗号应正确使用 CSV 引号，避免拆成多列。</w:t>
+        <w:br/>
       </w:r>
     </w:p>
     <w:p>
@@ -2270,8 +2132,8 @@
         </w:rPr>
         <w:drawing>
           <wp:inline xmlns:a="http://schemas.openxmlformats.org/drawingml/2006/main" xmlns:pic="http://schemas.openxmlformats.org/drawingml/2006/picture">
-            <wp:extent cx="3268002" cy="4663439"/>
-            <wp:docPr id="10" name="Picture 10" descr="图9 清单清洗下载和记录的操作顺序"/>
+            <wp:extent cx="2642110" cy="4206239"/>
+            <wp:docPr id="13" name="Picture 13" descr="图12 三条输入对应两篇文献"/>
             <wp:cNvGraphicFramePr>
               <a:graphicFrameLocks noChangeAspect="1"/>
             </wp:cNvGraphicFramePr>
@@ -2279,11 +2141,11 @@
               <a:graphicData uri="http://schemas.openxmlformats.org/drawingml/2006/picture">
                 <pic:pic>
                   <pic:nvPicPr>
-                    <pic:cNvPr id="0" name="09-batch.png"/>
+                    <pic:cNvPr id="0" name="22-duplicate-map.png"/>
                     <pic:cNvPicPr/>
                   </pic:nvPicPr>
                   <pic:blipFill>
-                    <a:blip r:embed="rId32"/>
+                    <a:blip r:embed="rId34"/>
                     <a:stretch>
                       <a:fillRect/>
                     </a:stretch>
@@ -2291,7 +2153,7 @@
                   <pic:spPr>
                     <a:xfrm>
                       <a:off x="0" y="0"/>
-                      <a:ext cx="3268002" cy="4663439"/>
+                      <a:ext cx="2642110" cy="4206239"/>
                     </a:xfrm>
                     <a:prstGeom prst="rect"/>
                   </pic:spPr>
@@ -2310,22 +2172,102 @@
         <w:rPr>
           <w:rFonts w:eastAsia="Arial Unicode MS" w:ascii="Arial Unicode MS" w:hAnsi="Arial Unicode MS"/>
         </w:rPr>
-        <w:t>图9｜批量操作图。先核对输入与重复项，再下载；三行示例应定位到两篇不同文献。</w:t>
+        <w:t>图12｜教学映射，非 Hermes 运行结果。第 2、3 条使用不同编号，实际指向同一篇 Aplastic Anemia。</w:t>
+      </w:r>
+    </w:p>
+    <w:p>
+      <w:pPr/>
+      <w:r>
+        <w:rPr>
+          <w:rFonts w:eastAsia="Arial Unicode MS" w:ascii="Arial Unicode MS" w:hAnsi="Arial Unicode MS"/>
+        </w:rPr>
+        <w:t>示例应得到</w:t>
+      </w:r>
+      <w:r>
+        <w:rPr>
+          <w:rFonts w:eastAsia="Arial Unicode MS" w:ascii="Arial Unicode MS" w:hAnsi="Arial Unicode MS"/>
+          <w:b/>
+        </w:rPr>
+        <w:t>三条输入、两篇不同文献</w:t>
+      </w:r>
+      <w:r>
+        <w:rPr>
+          <w:rFonts w:eastAsia="Arial Unicode MS" w:ascii="Arial Unicode MS" w:hAnsi="Arial Unicode MS"/>
+        </w:rPr>
+        <w:t>；重复输入保留映射，下载时只处理一次。题名相似或预印本与发表版关系未确认时，保留待核对。</w:t>
       </w:r>
     </w:p>
     <w:p>
       <w:pPr>
-        <w:pStyle w:val="Heading2"/>
+        <w:keepNext/>
+      </w:pPr>
+      <w:r>
+        <w:rPr>
+          <w:rFonts w:eastAsia="Arial Unicode MS" w:ascii="Arial Unicode MS" w:hAnsi="Arial Unicode MS"/>
+          <w:b/>
+        </w:rPr>
+        <w:t>再处理第一小批：</w:t>
+      </w:r>
+    </w:p>
+    <w:p>
+      <w:pPr>
+        <w:pStyle w:val="HermesPrompt"/>
+        <w:keepLines/>
+        <w:shd w:fill="EDF7F3"/>
+        <w:ind w:left="173" w:right="173"/>
       </w:pPr>
       <w:r>
         <w:rPr>
           <w:rFonts w:eastAsia="Arial Unicode MS" w:ascii="Arial Unicode MS" w:hAnsi="Arial Unicode MS"/>
         </w:rPr>
-        <w:t>先检查清单 不急着下载</w:t>
+        <w:br/>
+      </w:r>
+      <w:r>
+        <w:rPr>
+          <w:rFonts w:eastAsia="Arial Unicode MS" w:ascii="Arial Unicode MS" w:hAnsi="Arial Unicode MS"/>
+        </w:rPr>
+        <w:t>请按已核对清单获取全文，本次最多五篇不同文献。逐篇确认身份、找来源、下载并核验，串行执行；限流按要求等待，每个来源最多重试两次。PMC 使用当前允许服务。新建 03_batch/pdf、03_batch/fulltext_other 和 03_batch/metadata，避免覆盖文件。每处理一篇更新 metadata/manifest.csv，记录输入行号、题名、DOI、PMID、来源、版本、路径、状态、原因和时间；失败也保留。保存 README.txt，返回输入数、唯一文献数、各状态数量与清单路径，不扩展范围。</w:t>
+      </w:r>
+      <w:r>
+        <w:rPr>
+          <w:rFonts w:eastAsia="Arial Unicode MS" w:ascii="Arial Unicode MS" w:hAnsi="Arial Unicode MS"/>
+        </w:rPr>
+        <w:br/>
       </w:r>
     </w:p>
     <w:p>
       <w:pPr/>
+      <w:r>
+        <w:rPr>
+          <w:rFonts w:eastAsia="Arial Unicode MS" w:ascii="Arial Unicode MS" w:hAnsi="Arial Unicode MS"/>
+        </w:rPr>
+        <w:t>打开本批文件和清单，确认无误配、覆盖或版本混乱，再增加数量。其他格式全文单独统计，不计为已核验 PDF。</w:t>
+      </w:r>
+    </w:p>
+    <w:p>
+      <w:pPr>
+        <w:pStyle w:val="Heading1"/>
+      </w:pPr>
+      <w:r>
+        <w:rPr>
+          <w:rFonts w:eastAsia="Arial Unicode MS" w:ascii="Arial Unicode MS" w:hAnsi="Arial Unicode MS"/>
+        </w:rPr>
+        <w:t>09 只有研究主题，先生成候选清单</w:t>
+      </w:r>
+    </w:p>
+    <w:p>
+      <w:pPr/>
+      <w:r>
+        <w:rPr>
+          <w:rFonts w:eastAsia="Arial Unicode MS" w:ascii="Arial Unicode MS" w:hAnsi="Arial Unicode MS"/>
+        </w:rPr>
+        <w:t>先限定对象、主题、年份和数量。下面用于检索练习，不代表完整系统综述策略。</w:t>
+      </w:r>
+    </w:p>
+    <w:p>
+      <w:pPr>
+        <w:keepNext/>
+      </w:pPr>
       <w:r>
         <w:rPr>
           <w:rFonts w:eastAsia="Arial Unicode MS" w:ascii="Arial Unicode MS" w:hAnsi="Arial Unicode MS"/>
@@ -2351,43 +2293,7 @@
         <w:rPr>
           <w:rFonts w:eastAsia="Arial Unicode MS" w:ascii="Arial Unicode MS" w:hAnsi="Arial Unicode MS"/>
         </w:rPr>
-        <w:t>请读取当前工作目录的 papers.csv，先不要下载。</w:t>
-      </w:r>
-      <w:r>
-        <w:rPr>
-          <w:rFonts w:eastAsia="Arial Unicode MS" w:ascii="Arial Unicode MS" w:hAnsi="Arial Unicode MS"/>
-        </w:rPr>
-        <w:br/>
-      </w:r>
-      <w:r>
-        <w:rPr>
-          <w:rFonts w:eastAsia="Arial Unicode MS" w:ascii="Arial Unicode MS" w:hAnsi="Arial Unicode MS"/>
-        </w:rPr>
-        <w:t>检查字段、数据行数和空值；将 DOI 去除网址前缀与首尾空格，并以规范化 DOI、PMID 及题录对应关系识别重复。只有题名相似但身份未确认的项目，标记待核对，不能直接合并。</w:t>
-      </w:r>
-      <w:r>
-        <w:rPr>
-          <w:rFonts w:eastAsia="Arial Unicode MS" w:ascii="Arial Unicode MS" w:hAnsi="Arial Unicode MS"/>
-        </w:rPr>
-        <w:br/>
-      </w:r>
-      <w:r>
-        <w:rPr>
-          <w:rFonts w:eastAsia="Arial Unicode MS" w:ascii="Arial Unicode MS" w:hAnsi="Arial Unicode MS"/>
-        </w:rPr>
-        <w:t>输出 input_checked.csv，保留每个原始行号和处理结果；另列需要下载的不同文献。所有字段值都应来自输入或实际核对，不要补造标识符。</w:t>
-      </w:r>
-      <w:r>
-        <w:rPr>
-          <w:rFonts w:eastAsia="Arial Unicode MS" w:ascii="Arial Unicode MS" w:hAnsi="Arial Unicode MS"/>
-        </w:rPr>
-        <w:br/>
-      </w:r>
-      <w:r>
-        <w:rPr>
-          <w:rFonts w:eastAsia="Arial Unicode MS" w:ascii="Arial Unicode MS" w:hAnsi="Arial Unicode MS"/>
-        </w:rPr>
-        <w:t>返回原始行数、重复关系、唯一文献数量和需要人工确认的项目。</w:t>
+        <w:t>请查找获得性再生障碍性贫血与造血干细胞移植文献，范围 2021-01-01 至 2026-10-02。先不下载；提出 PubMed 检索式，解释关键词、字段、日期及如何区分获得性疾病与遗传性骨髓衰竭。实际检索后列十篇候选，记录题名、作者、年份、研究类型、DOI、PMID、题录链接、全文状态和入选原因。报告实际检索式、日期、排序和结果范围，不声称十篇覆盖全部证据；摘要可确认的内容与需阅读全文确认的内容分开，不推断缺失信息。</w:t>
       </w:r>
       <w:r>
         <w:rPr>
@@ -2402,135 +2308,7 @@
         <w:rPr>
           <w:rFonts w:eastAsia="Arial Unicode MS" w:ascii="Arial Unicode MS" w:hAnsi="Arial Unicode MS"/>
         </w:rPr>
-        <w:t>练习清单应报告三条输入、两篇不同文献，并说明两条 Aplastic Anemia 记录为什么对应同一篇论文。如果没有识别出来，先要求它核对 PMID 与 DOI 的关系，再进行获取。</w:t>
-      </w:r>
-    </w:p>
-    <w:p>
-      <w:pPr>
-        <w:pStyle w:val="Heading2"/>
-      </w:pPr>
-      <w:r>
-        <w:rPr>
-          <w:rFonts w:eastAsia="Arial Unicode MS" w:ascii="Arial Unicode MS" w:hAnsi="Arial Unicode MS"/>
-        </w:rPr>
-        <w:t>再处理第一小批</w:t>
-      </w:r>
-    </w:p>
-    <w:p>
-      <w:pPr/>
-      <w:r>
-        <w:rPr>
-          <w:rFonts w:eastAsia="Arial Unicode MS" w:ascii="Arial Unicode MS" w:hAnsi="Arial Unicode MS"/>
-          <w:b/>
-        </w:rPr>
-        <w:t>复制给 Hermes：</w:t>
-      </w:r>
-    </w:p>
-    <w:p>
-      <w:pPr>
-        <w:pStyle w:val="HermesPrompt"/>
-        <w:keepLines/>
-        <w:shd w:fill="EDF7F3"/>
-        <w:ind w:left="173" w:right="173"/>
-      </w:pPr>
-      <w:r>
-        <w:rPr>
-          <w:rFonts w:eastAsia="Arial Unicode MS" w:ascii="Arial Unicode MS" w:hAnsi="Arial Unicode MS"/>
-        </w:rPr>
-        <w:br/>
-      </w:r>
-      <w:r>
-        <w:rPr>
-          <w:rFonts w:eastAsia="Arial Unicode MS" w:ascii="Arial Unicode MS" w:hAnsi="Arial Unicode MS"/>
-        </w:rPr>
-        <w:t xml:space="preserve">请按刚核对的清单获取全文，先处理最多五篇不同文献。  </w:t>
-      </w:r>
-      <w:r>
-        <w:rPr>
-          <w:rFonts w:eastAsia="Arial Unicode MS" w:ascii="Arial Unicode MS" w:hAnsi="Arial Unicode MS"/>
-        </w:rPr>
-        <w:br/>
-      </w:r>
-      <w:r>
-        <w:rPr>
-          <w:rFonts w:eastAsia="Arial Unicode MS" w:ascii="Arial Unicode MS" w:hAnsi="Arial Unicode MS"/>
-        </w:rPr>
-        <w:br/>
-      </w:r>
-      <w:r>
-        <w:rPr>
-          <w:rFonts w:eastAsia="Arial Unicode MS" w:ascii="Arial Unicode MS" w:hAnsi="Arial Unicode MS"/>
-        </w:rPr>
-        <w:t xml:space="preserve">逐篇确认身份、查找来源、下载并核验，串行执行；遇到限流按服务要求等待，每个来源最多重试两次。PMC 内容使用当前官方允许的自动获取服务。  </w:t>
-      </w:r>
-      <w:r>
-        <w:rPr>
-          <w:rFonts w:eastAsia="Arial Unicode MS" w:ascii="Arial Unicode MS" w:hAnsi="Arial Unicode MS"/>
-        </w:rPr>
-        <w:br/>
-      </w:r>
-      <w:r>
-        <w:rPr>
-          <w:rFonts w:eastAsia="Arial Unicode MS" w:ascii="Arial Unicode MS" w:hAnsi="Arial Unicode MS"/>
-        </w:rPr>
-        <w:t xml:space="preserve">在当前工作目录创建 03_batch/pdf、03_batch/fulltext_other 和 03_batch/metadata。PDF 与其他全文分别保存，避免覆盖已有文件。  </w:t>
-      </w:r>
-      <w:r>
-        <w:rPr>
-          <w:rFonts w:eastAsia="Arial Unicode MS" w:ascii="Arial Unicode MS" w:hAnsi="Arial Unicode MS"/>
-        </w:rPr>
-        <w:br/>
-      </w:r>
-      <w:r>
-        <w:rPr>
-          <w:rFonts w:eastAsia="Arial Unicode MS" w:ascii="Arial Unicode MS" w:hAnsi="Arial Unicode MS"/>
-        </w:rPr>
-        <w:t xml:space="preserve">将清单写入 03_batch/metadata/manifest.csv，至少记录原始行号、题名、DOI、PMID、来源、版本、路径、状态、原因和时间。每处理完一篇即更新。  </w:t>
-      </w:r>
-      <w:r>
-        <w:rPr>
-          <w:rFonts w:eastAsia="Arial Unicode MS" w:ascii="Arial Unicode MS" w:hAnsi="Arial Unicode MS"/>
-        </w:rPr>
-        <w:br/>
-      </w:r>
-      <w:r>
-        <w:rPr>
-          <w:rFonts w:eastAsia="Arial Unicode MS" w:ascii="Arial Unicode MS" w:hAnsi="Arial Unicode MS"/>
-        </w:rPr>
-        <w:t xml:space="preserve">保存处理说明到 README.txt；失败项目也必须保留，不要只汇报成功项。  </w:t>
-      </w:r>
-      <w:r>
-        <w:rPr>
-          <w:rFonts w:eastAsia="Arial Unicode MS" w:ascii="Arial Unicode MS" w:hAnsi="Arial Unicode MS"/>
-        </w:rPr>
-        <w:br/>
-      </w:r>
-      <w:r>
-        <w:rPr>
-          <w:rFonts w:eastAsia="Arial Unicode MS" w:ascii="Arial Unicode MS" w:hAnsi="Arial Unicode MS"/>
-        </w:rPr>
-        <w:t>返回输入行数、去重后数量、各状态数量和清单路径。本次最多处理五篇，不要扩展到其他文献。</w:t>
-      </w:r>
-      <w:r>
-        <w:rPr>
-          <w:rFonts w:eastAsia="Arial Unicode MS" w:ascii="Arial Unicode MS" w:hAnsi="Arial Unicode MS"/>
-        </w:rPr>
-        <w:br/>
-      </w:r>
-      <w:r>
-        <w:rPr>
-          <w:rFonts w:eastAsia="Arial Unicode MS" w:ascii="Arial Unicode MS" w:hAnsi="Arial Unicode MS"/>
-        </w:rPr>
-        <w:br/>
-      </w:r>
-    </w:p>
-    <w:p>
-      <w:pPr/>
-      <w:r>
-        <w:rPr>
-          <w:rFonts w:eastAsia="Arial Unicode MS" w:ascii="Arial Unicode MS" w:hAnsi="Arial Unicode MS"/>
-        </w:rPr>
-        <w:t>先看这批的文件和记录。确认没有误配、重复覆盖或版本混乱后，再把数量提高。将任务拆成多个小批次，也更方便观察模型用量和网页服务限流。</w:t>
+        <w:t>你选定后，再让它仅获取选中的文献，沿用保存与核验要求。下载完成不等于完成质量评价或临床证据分析。</w:t>
       </w:r>
     </w:p>
     <w:p>
@@ -2541,126 +2319,7 @@
         <w:rPr>
           <w:rFonts w:eastAsia="Arial Unicode MS" w:ascii="Arial Unicode MS" w:hAnsi="Arial Unicode MS"/>
         </w:rPr>
-        <w:t>09 只有研究主题时 先得到可核对的候选清单</w:t>
-      </w:r>
-    </w:p>
-    <w:p>
-      <w:pPr/>
-      <w:r>
-        <w:rPr>
-          <w:rFonts w:eastAsia="Arial Unicode MS" w:ascii="Arial Unicode MS" w:hAnsi="Arial Unicode MS"/>
-        </w:rPr>
-        <w:t>“帮我下载所有再生障碍性贫血的论文”范围太大。更容易执行的做法是先给出研究对象、主题、年份和数量，再让 Hermes 提出检索式。</w:t>
-      </w:r>
-    </w:p>
-    <w:p>
-      <w:pPr/>
-      <w:r>
-        <w:rPr>
-          <w:rFonts w:eastAsia="Arial Unicode MS" w:ascii="Arial Unicode MS" w:hAnsi="Arial Unicode MS"/>
-        </w:rPr>
-        <w:t>下面是一个医学检索练习。它用于训练检索与记录流程，不代表完整的系统综述检索策略。</w:t>
-      </w:r>
-    </w:p>
-    <w:p>
-      <w:pPr/>
-      <w:r>
-        <w:rPr>
-          <w:rFonts w:eastAsia="Arial Unicode MS" w:ascii="Arial Unicode MS" w:hAnsi="Arial Unicode MS"/>
-          <w:b/>
-        </w:rPr>
-        <w:t>复制给 Hermes：</w:t>
-      </w:r>
-    </w:p>
-    <w:p>
-      <w:pPr>
-        <w:pStyle w:val="HermesPrompt"/>
-        <w:keepLines/>
-        <w:shd w:fill="EDF7F3"/>
-        <w:ind w:left="173" w:right="173"/>
-      </w:pPr>
-      <w:r>
-        <w:rPr>
-          <w:rFonts w:eastAsia="Arial Unicode MS" w:ascii="Arial Unicode MS" w:hAnsi="Arial Unicode MS"/>
-        </w:rPr>
-        <w:br/>
-      </w:r>
-      <w:r>
-        <w:rPr>
-          <w:rFonts w:eastAsia="Arial Unicode MS" w:ascii="Arial Unicode MS" w:hAnsi="Arial Unicode MS"/>
-        </w:rPr>
-        <w:t>我想查找获得性再生障碍性贫血与造血干细胞移植的文献，时间范围为 2021-01-01 至 2026-10-02。</w:t>
-      </w:r>
-      <w:r>
-        <w:rPr>
-          <w:rFonts w:eastAsia="Arial Unicode MS" w:ascii="Arial Unicode MS" w:hAnsi="Arial Unicode MS"/>
-        </w:rPr>
-        <w:br/>
-      </w:r>
-      <w:r>
-        <w:rPr>
-          <w:rFonts w:eastAsia="Arial Unicode MS" w:ascii="Arial Unicode MS" w:hAnsi="Arial Unicode MS"/>
-        </w:rPr>
-        <w:t>先不要下载，请提出 PubMed 检索式，解释关键词、字段和日期范围，并说明如何区分获得性疾病与遗传性骨髓衰竭。</w:t>
-      </w:r>
-      <w:r>
-        <w:rPr>
-          <w:rFonts w:eastAsia="Arial Unicode MS" w:ascii="Arial Unicode MS" w:hAnsi="Arial Unicode MS"/>
-        </w:rPr>
-        <w:br/>
-      </w:r>
-      <w:r>
-        <w:rPr>
-          <w:rFonts w:eastAsia="Arial Unicode MS" w:ascii="Arial Unicode MS" w:hAnsi="Arial Unicode MS"/>
-        </w:rPr>
-        <w:t>检索后先给我十篇候选文献，逐条记录题名、作者、年份、研究类型、DOI、PMID、题录链接、全文状态和初步入选原因。报告实际执行的检索式、检索日期、排序方式和结果范围，不要声称十篇就覆盖全部证据。</w:t>
-      </w:r>
-      <w:r>
-        <w:rPr>
-          <w:rFonts w:eastAsia="Arial Unicode MS" w:ascii="Arial Unicode MS" w:hAnsi="Arial Unicode MS"/>
-        </w:rPr>
-        <w:br/>
-      </w:r>
-      <w:r>
-        <w:rPr>
-          <w:rFonts w:eastAsia="Arial Unicode MS" w:ascii="Arial Unicode MS" w:hAnsi="Arial Unicode MS"/>
-        </w:rPr>
-        <w:t>从题录或摘要可以确认的内容，与需要阅读全文才能确认的内容分开标注。不得推断缺失信息。</w:t>
-      </w:r>
-      <w:r>
-        <w:rPr>
-          <w:rFonts w:eastAsia="Arial Unicode MS" w:ascii="Arial Unicode MS" w:hAnsi="Arial Unicode MS"/>
-        </w:rPr>
-        <w:br/>
-      </w:r>
-    </w:p>
-    <w:p>
-      <w:pPr/>
-      <w:r>
-        <w:rPr>
-          <w:rFonts w:eastAsia="Arial Unicode MS" w:ascii="Arial Unicode MS" w:hAnsi="Arial Unicode MS"/>
-        </w:rPr>
-        <w:t>你核对候选清单并选定文献后，再发送：“请仅获取我选中的文献，沿用前文的保存、核验和状态记录要求。”</w:t>
-      </w:r>
-    </w:p>
-    <w:p>
-      <w:pPr/>
-      <w:r>
-        <w:rPr>
-          <w:rFonts w:eastAsia="Arial Unicode MS" w:ascii="Arial Unicode MS" w:hAnsi="Arial Unicode MS"/>
-        </w:rPr>
-        <w:t>这一步让人保留对研究范围和纳入标准的判断。下载齐了几份文件，并不意味着已经完成文献质量评价或临床证据分析。</w:t>
-      </w:r>
-    </w:p>
-    <w:p>
-      <w:pPr>
-        <w:pStyle w:val="Heading1"/>
-      </w:pPr>
-      <w:r>
-        <w:rPr>
-          <w:rFonts w:eastAsia="Arial Unicode MS" w:ascii="Arial Unicode MS" w:hAnsi="Arial Unicode MS"/>
-        </w:rPr>
-        <w:t>10 下载后 用四项检查确认全文可用</w:t>
+        <w:t>10 核验全文，记录状态与版本</w:t>
       </w:r>
     </w:p>
     <w:p>
@@ -2675,8 +2334,8 @@
         </w:rPr>
         <w:drawing>
           <wp:inline xmlns:a="http://schemas.openxmlformats.org/drawingml/2006/main" xmlns:pic="http://schemas.openxmlformats.org/drawingml/2006/picture">
-            <wp:extent cx="2929296" cy="4663439"/>
-            <wp:docPr id="11" name="Picture 11" descr="图10 PDF 的四项核验"/>
+            <wp:extent cx="2642110" cy="4206239"/>
+            <wp:docPr id="14" name="Picture 14" descr="图13 PDF 的四项核验"/>
             <wp:cNvGraphicFramePr>
               <a:graphicFrameLocks noChangeAspect="1"/>
             </wp:cNvGraphicFramePr>
@@ -2688,7 +2347,7 @@
                     <pic:cNvPicPr/>
                   </pic:nvPicPr>
                   <pic:blipFill>
-                    <a:blip r:embed="rId33"/>
+                    <a:blip r:embed="rId35"/>
                     <a:stretch>
                       <a:fillRect/>
                     </a:stretch>
@@ -2696,7 +2355,7 @@
                   <pic:spPr>
                     <a:xfrm>
                       <a:off x="0" y="0"/>
-                      <a:ext cx="2929296" cy="4663439"/>
+                      <a:ext cx="2642110" cy="4206239"/>
                     </a:xfrm>
                     <a:prstGeom prst="rect"/>
                   </pic:spPr>
@@ -2715,84 +2374,7 @@
         <w:rPr>
           <w:rFonts w:eastAsia="Arial Unicode MS" w:ascii="Arial Unicode MS" w:hAnsi="Arial Unicode MS"/>
         </w:rPr>
-        <w:t>图10｜核验清单。文件格式、文献身份、正文完整性和版本都应检查。</w:t>
-      </w:r>
-    </w:p>
-    <w:p>
-      <w:pPr/>
-      <w:r>
-        <w:rPr>
-          <w:rFonts w:eastAsia="Arial Unicode MS" w:ascii="Arial Unicode MS" w:hAnsi="Arial Unicode MS"/>
-          <w:b/>
-        </w:rPr>
-        <w:t>第一项，文件能不能打开。</w:t>
-      </w:r>
-      <w:r>
-        <w:rPr>
-          <w:rFonts w:eastAsia="Arial Unicode MS" w:ascii="Arial Unicode MS" w:hAnsi="Arial Unicode MS"/>
-        </w:rPr>
-        <w:t xml:space="preserve"> 让工具解析 PDF，同时由你打开确认。HTML 登录页、错误页即使被命名为 </w:t>
-      </w:r>
-      <w:r>
-        <w:rPr>
-          <w:rFonts w:ascii="Menlo" w:hAnsi="Menlo" w:eastAsia="Arial Unicode MS"/>
-          <w:sz w:val="18"/>
-        </w:rPr>
-        <w:t>.pdf</w:t>
-      </w:r>
-      <w:r>
-        <w:rPr>
-          <w:rFonts w:eastAsia="Arial Unicode MS" w:ascii="Arial Unicode MS" w:hAnsi="Arial Unicode MS"/>
-        </w:rPr>
-        <w:t>，仍然不是 PDF。反过来，一个能解析的 PDF 也可能是下载提示页，仍要继续看内容。</w:t>
-      </w:r>
-    </w:p>
-    <w:p>
-      <w:pPr/>
-      <w:r>
-        <w:rPr>
-          <w:rFonts w:eastAsia="Arial Unicode MS" w:ascii="Arial Unicode MS" w:hAnsi="Arial Unicode MS"/>
-          <w:b/>
-        </w:rPr>
-        <w:t>第二项，是不是同一篇论文。</w:t>
-      </w:r>
-      <w:r>
-        <w:rPr>
-          <w:rFonts w:eastAsia="Arial Unicode MS" w:ascii="Arial Unicode MS" w:hAnsi="Arial Unicode MS"/>
-        </w:rPr>
-        <w:t xml:space="preserve"> 将首页题名、作者与清单比较，并在可见处核对 DOI 或其他标识符。题名大小写和排版差异不一定是错误，但研究主题相似不能证明身份相同。</w:t>
-      </w:r>
-    </w:p>
-    <w:p>
-      <w:pPr/>
-      <w:r>
-        <w:rPr>
-          <w:rFonts w:eastAsia="Arial Unicode MS" w:ascii="Arial Unicode MS" w:hAnsi="Arial Unicode MS"/>
-          <w:b/>
-        </w:rPr>
-        <w:t>第三项，是否为目标全文。</w:t>
-      </w:r>
-      <w:r>
-        <w:rPr>
-          <w:rFonts w:eastAsia="Arial Unicode MS" w:ascii="Arial Unicode MS" w:hAnsi="Arial Unicode MS"/>
-        </w:rPr>
-        <w:t xml:space="preserve"> 核对正文和参考文献是否存在；把正文、补充材料、勘误和摘要分开。记录页数有助于复查，但不能只凭页数判断完整性。</w:t>
-      </w:r>
-    </w:p>
-    <w:p>
-      <w:pPr/>
-      <w:r>
-        <w:rPr>
-          <w:rFonts w:eastAsia="Arial Unicode MS" w:ascii="Arial Unicode MS" w:hAnsi="Arial Unicode MS"/>
-          <w:b/>
-        </w:rPr>
-        <w:t>第四项，版本和来源是否说得清。</w:t>
-      </w:r>
-      <w:r>
-        <w:rPr>
-          <w:rFonts w:eastAsia="Arial Unicode MS" w:ascii="Arial Unicode MS" w:hAnsi="Arial Unicode MS"/>
-        </w:rPr>
-        <w:t xml:space="preserve"> 作者接受稿、预印本和发表版可以有不同排版甚至内容。清单注明版本、来源 URL 和获取时间；无法确认版本时就写“待核对”。</w:t>
+        <w:t>图13｜核验清单。格式、身份、全文与版本分别检查。</w:t>
       </w:r>
     </w:p>
     <w:p>
@@ -2801,7 +2383,119 @@
         <w:rPr>
           <w:rFonts w:eastAsia="Arial Unicode MS" w:ascii="Arial Unicode MS" w:hAnsi="Arial Unicode MS"/>
         </w:rPr>
-        <w:t>状态建议统一成下面几类。它们是本教程的记录约定，便于筛选和续做：</w:t>
+        <w:t>让工具解析 PDF，同时由你打开；看首页题名与作者、正文和参考文献。能解析的 PDF 也可能只是提示页，页数本身不能证明完整。</w:t>
+      </w:r>
+    </w:p>
+    <w:p>
+      <w:pPr>
+        <w:keepNext/>
+        <w:spacing w:after="80"/>
+        <w:jc w:val="center"/>
+      </w:pPr>
+      <w:r>
+        <w:rPr>
+          <w:rFonts w:eastAsia="Arial Unicode MS" w:ascii="Arial Unicode MS" w:hAnsi="Arial Unicode MS"/>
+        </w:rPr>
+        <w:drawing>
+          <wp:inline xmlns:a="http://schemas.openxmlformats.org/drawingml/2006/main" xmlns:pic="http://schemas.openxmlformats.org/drawingml/2006/picture">
+            <wp:extent cx="3017388" cy="4206239"/>
+            <wp:docPr id="15" name="Picture 15" descr="图14 版本记录"/>
+            <wp:cNvGraphicFramePr>
+              <a:graphicFrameLocks noChangeAspect="1"/>
+            </wp:cNvGraphicFramePr>
+            <a:graphic>
+              <a:graphicData uri="http://schemas.openxmlformats.org/drawingml/2006/picture">
+                <pic:pic>
+                  <pic:nvPicPr>
+                    <pic:cNvPr id="0" name="23-version-record.png"/>
+                    <pic:cNvPicPr/>
+                  </pic:nvPicPr>
+                  <pic:blipFill>
+                    <a:blip r:embed="rId36"/>
+                    <a:stretch>
+                      <a:fillRect/>
+                    </a:stretch>
+                  </pic:blipFill>
+                  <pic:spPr>
+                    <a:xfrm>
+                      <a:off x="0" y="0"/>
+                      <a:ext cx="3017388" cy="4206239"/>
+                    </a:xfrm>
+                    <a:prstGeom prst="rect"/>
+                  </pic:spPr>
+                </pic:pic>
+              </a:graphicData>
+            </a:graphic>
+          </wp:inline>
+        </w:drawing>
+      </w:r>
+    </w:p>
+    <w:p>
+      <w:pPr>
+        <w:pStyle w:val="HermesCaption"/>
+      </w:pPr>
+      <w:r>
+        <w:rPr>
+          <w:rFonts w:eastAsia="Arial Unicode MS" w:ascii="Arial Unicode MS" w:hAnsi="Arial Unicode MS"/>
+        </w:rPr>
+        <w:t>图14｜版本指引，非软件截图。同一研究可以有多个版本。</w:t>
+      </w:r>
+    </w:p>
+    <w:p>
+      <w:pPr/>
+      <w:r>
+        <w:rPr>
+          <w:rFonts w:eastAsia="Arial Unicode MS" w:ascii="Arial Unicode MS" w:hAnsi="Arial Unicode MS"/>
+        </w:rPr>
+        <w:t xml:space="preserve">记录 </w:t>
+      </w:r>
+      <w:r>
+        <w:rPr>
+          <w:rFonts w:ascii="Menlo" w:hAnsi="Menlo" w:eastAsia="Arial Unicode MS"/>
+          <w:sz w:val="18"/>
+        </w:rPr>
+        <w:t>version</w:t>
+      </w:r>
+      <w:r>
+        <w:rPr>
+          <w:rFonts w:eastAsia="Arial Unicode MS" w:ascii="Arial Unicode MS" w:hAnsi="Arial Unicode MS"/>
+        </w:rPr>
+        <w:t>、</w:t>
+      </w:r>
+      <w:r>
+        <w:rPr>
+          <w:rFonts w:ascii="Menlo" w:hAnsi="Menlo" w:eastAsia="Arial Unicode MS"/>
+          <w:sz w:val="18"/>
+        </w:rPr>
+        <w:t>source_url</w:t>
+      </w:r>
+      <w:r>
+        <w:rPr>
+          <w:rFonts w:eastAsia="Arial Unicode MS" w:ascii="Arial Unicode MS" w:hAnsi="Arial Unicode MS"/>
+        </w:rPr>
+        <w:t xml:space="preserve"> 和获取时间；arXiv 保留实际版本号，仓储注明作者接受稿，无法确认写待核对。文件可按 </w:t>
+      </w:r>
+      <w:r>
+        <w:rPr>
+          <w:rFonts w:ascii="Menlo" w:hAnsi="Menlo" w:eastAsia="Arial Unicode MS"/>
+          <w:sz w:val="18"/>
+        </w:rPr>
+        <w:t>YYYY_Author_ShortTitle_Version.pdf</w:t>
+      </w:r>
+      <w:r>
+        <w:rPr>
+          <w:rFonts w:eastAsia="Arial Unicode MS" w:ascii="Arial Unicode MS" w:hAnsi="Arial Unicode MS"/>
+        </w:rPr>
+        <w:t xml:space="preserve"> 命名，重名时保留原文件。</w:t>
+      </w:r>
+    </w:p>
+    <w:p>
+      <w:pPr/>
+      <w:r>
+        <w:rPr>
+          <w:rFonts w:eastAsia="Arial Unicode MS" w:ascii="Arial Unicode MS" w:hAnsi="Arial Unicode MS"/>
+        </w:rPr>
+        <w:t>以下状态是本文约定，并非 Hermes 内置固定输出：</w:t>
       </w:r>
     </w:p>
     <w:tbl>
@@ -2810,6 +2504,14 @@
         <w:tblW w:type="auto" w:w="0"/>
         <w:tblLayout w:type="fixed"/>
         <w:tblLook w:firstColumn="1" w:firstRow="1" w:lastColumn="0" w:lastRow="0" w:noHBand="0" w:noVBand="1" w:val="04A0"/>
+        <w:tblBorders>
+          <w:top w:val="single" w:sz="4" w:color="D9D9D9"/>
+          <w:left w:val="single" w:sz="4" w:color="D9D9D9"/>
+          <w:bottom w:val="single" w:sz="4" w:color="D9D9D9"/>
+          <w:right w:val="single" w:sz="4" w:color="D9D9D9"/>
+          <w:insideH w:val="single" w:sz="4" w:color="D9D9D9"/>
+          <w:insideV w:val="single" w:sz="4" w:color="D9D9D9"/>
+        </w:tblBorders>
       </w:tblPr>
       <w:tblGrid>
         <w:gridCol w:w="3456"/>
@@ -2832,6 +2534,7 @@
             <w:r>
               <w:rPr>
                 <w:b/>
+                <w:color w:val="000000"/>
                 <w:sz w:val="19"/>
               </w:rPr>
               <w:t>状态</w:t>
@@ -2850,9 +2553,10 @@
             <w:r>
               <w:rPr>
                 <w:b/>
+                <w:color w:val="000000"/>
                 <w:sz w:val="19"/>
               </w:rPr>
-              <w:t>何时使用</w:t>
+              <w:t>含义</w:t>
             </w:r>
           </w:p>
         </w:tc>
@@ -2891,7 +2595,7 @@
                 <w:b w:val="0"/>
                 <w:sz w:val="19"/>
               </w:rPr>
-              <w:t>PDF 已保存并通过核验</w:t>
+              <w:t>PDF 已保存且通过核验</w:t>
             </w:r>
           </w:p>
         </w:tc>
@@ -2930,7 +2634,7 @@
                 <w:b w:val="0"/>
                 <w:sz w:val="19"/>
               </w:rPr>
-              <w:t>已取得 HTML、XML、TXT 等其他格式全文</w:t>
+              <w:t>已取得其他格式全文</w:t>
             </w:r>
           </w:p>
         </w:tc>
@@ -2969,7 +2673,7 @@
                 <w:b w:val="0"/>
                 <w:sz w:val="19"/>
               </w:rPr>
-              <w:t>需要机构订阅、登录或人工获取</w:t>
+              <w:t>需要订阅、登录或人工获取</w:t>
             </w:r>
           </w:p>
         </w:tc>
@@ -3008,7 +2712,7 @@
                 <w:b w:val="0"/>
                 <w:sz w:val="19"/>
               </w:rPr>
-              <w:t>本次查找没有找到合适的全文入口</w:t>
+              <w:t>本次未找到合适全文入口</w:t>
             </w:r>
           </w:p>
         </w:tc>
@@ -3047,7 +2751,7 @@
                 <w:b w:val="0"/>
                 <w:sz w:val="19"/>
               </w:rPr>
-              <w:t>已尝试获取，但文件保存失败</w:t>
+              <w:t>全文获取或保存失败</w:t>
             </w:r>
           </w:p>
         </w:tc>
@@ -3086,7 +2790,7 @@
                 <w:b w:val="0"/>
                 <w:sz w:val="19"/>
               </w:rPr>
-              <w:t>文件取得了，但格式、身份或内容检查未通过</w:t>
+              <w:t>文件格式、身份或内容未通过</w:t>
             </w:r>
           </w:p>
         </w:tc>
@@ -3099,20 +2803,33 @@
         <w:rPr>
           <w:rFonts w:eastAsia="Arial Unicode MS" w:ascii="Arial Unicode MS" w:hAnsi="Arial Unicode MS"/>
         </w:rPr>
-        <w:t xml:space="preserve">重复项在 </w:t>
+        <w:t xml:space="preserve">配套 </w:t>
       </w:r>
       <w:r>
         <w:rPr>
           <w:rFonts w:ascii="Menlo" w:hAnsi="Menlo" w:eastAsia="Arial Unicode MS"/>
           <w:sz w:val="18"/>
         </w:rPr>
-        <w:t>input_checked.csv</w:t>
+        <w:t>manifest-template.csv</w:t>
       </w:r>
       <w:r>
         <w:rPr>
           <w:rFonts w:eastAsia="Arial Unicode MS" w:ascii="Arial Unicode MS" w:hAnsi="Arial Unicode MS"/>
         </w:rPr>
-        <w:t xml:space="preserve"> 中保留映射，不再重复计为待下载文献。汇报时，输入记录数、唯一文献数、已处理数和未处理数分别说明；“本次没找到”也不能扩大为“这篇论文没有全文”。</w:t>
+        <w:t xml:space="preserve"> 只有字段标题，是空白模板；</w:t>
+      </w:r>
+      <w:r>
+        <w:rPr>
+          <w:rFonts w:ascii="Menlo" w:hAnsi="Menlo" w:eastAsia="Arial Unicode MS"/>
+          <w:sz w:val="18"/>
+        </w:rPr>
+        <w:t>input-checked-example.csv</w:t>
+      </w:r>
+      <w:r>
+        <w:rPr>
+          <w:rFonts w:eastAsia="Arial Unicode MS" w:ascii="Arial Unicode MS" w:hAnsi="Arial Unicode MS"/>
+        </w:rPr>
+        <w:t xml:space="preserve"> 是教学映射，都不是已下载成果。</w:t>
       </w:r>
     </w:p>
     <w:p>
@@ -3127,8 +2844,8 @@
         </w:rPr>
         <w:drawing>
           <wp:inline xmlns:a="http://schemas.openxmlformats.org/drawingml/2006/main" xmlns:pic="http://schemas.openxmlformats.org/drawingml/2006/picture">
-            <wp:extent cx="3092466" cy="4663439"/>
-            <wp:docPr id="12" name="Picture 12" descr="图11 全文文件和记录的归档结构"/>
+            <wp:extent cx="2789283" cy="4206239"/>
+            <wp:docPr id="16" name="Picture 16" descr="图15 文件与记录一起归档"/>
             <wp:cNvGraphicFramePr>
               <a:graphicFrameLocks noChangeAspect="1"/>
             </wp:cNvGraphicFramePr>
@@ -3140,7 +2857,7 @@
                     <pic:cNvPicPr/>
                   </pic:nvPicPr>
                   <pic:blipFill>
-                    <a:blip r:embed="rId34"/>
+                    <a:blip r:embed="rId37"/>
                     <a:stretch>
                       <a:fillRect/>
                     </a:stretch>
@@ -3148,7 +2865,7 @@
                   <pic:spPr>
                     <a:xfrm>
                       <a:off x="0" y="0"/>
-                      <a:ext cx="3092466" cy="4663439"/>
+                      <a:ext cx="2789283" cy="4206239"/>
                     </a:xfrm>
                     <a:prstGeom prst="rect"/>
                   </pic:spPr>
@@ -3167,17 +2884,19 @@
         <w:rPr>
           <w:rFonts w:eastAsia="Arial Unicode MS" w:ascii="Arial Unicode MS" w:hAnsi="Arial Unicode MS"/>
         </w:rPr>
-        <w:t>图11｜本文建议的文件结构示例，非实际下载结果。文件路径应以你的运行环境为准。</w:t>
+        <w:t>图15｜建议目录结构，非实际执行结果。</w:t>
       </w:r>
     </w:p>
     <w:p>
-      <w:pPr/>
+      <w:pPr>
+        <w:keepNext/>
+      </w:pPr>
       <w:r>
         <w:rPr>
           <w:rFonts w:eastAsia="Arial Unicode MS" w:ascii="Arial Unicode MS" w:hAnsi="Arial Unicode MS"/>
           <w:b/>
         </w:rPr>
-        <w:t>让 Hermes 做一次收尾核对：</w:t>
+        <w:t>收尾核对：</w:t>
       </w:r>
     </w:p>
     <w:p>
@@ -3197,43 +2916,7 @@
         <w:rPr>
           <w:rFonts w:eastAsia="Arial Unicode MS" w:ascii="Arial Unicode MS" w:hAnsi="Arial Unicode MS"/>
         </w:rPr>
-        <w:t>请检查本次输出文件夹，逐条核对 manifest.csv 与实际文件。</w:t>
-      </w:r>
-      <w:r>
-        <w:rPr>
-          <w:rFonts w:eastAsia="Arial Unicode MS" w:ascii="Arial Unicode MS" w:hAnsi="Arial Unicode MS"/>
-        </w:rPr>
-        <w:br/>
-      </w:r>
-      <w:r>
-        <w:rPr>
-          <w:rFonts w:eastAsia="Arial Unicode MS" w:ascii="Arial Unicode MS" w:hAnsi="Arial Unicode MS"/>
-        </w:rPr>
-        <w:t>找出有记录却缺文件、有文件却无记录、重复文件和 verify_failed 项目；不要删除或覆盖文件。</w:t>
-      </w:r>
-      <w:r>
-        <w:rPr>
-          <w:rFonts w:eastAsia="Arial Unicode MS" w:ascii="Arial Unicode MS" w:hAnsi="Arial Unicode MS"/>
-        </w:rPr>
-        <w:br/>
-      </w:r>
-      <w:r>
-        <w:rPr>
-          <w:rFonts w:eastAsia="Arial Unicode MS" w:ascii="Arial Unicode MS" w:hAnsi="Arial Unicode MS"/>
-        </w:rPr>
-        <w:t>生成检查报告，并分别统计已处理和未处理文献。仅 downloaded_verified 计入核验通过的 PDF；fulltext_other 单独统计。</w:t>
-      </w:r>
-      <w:r>
-        <w:rPr>
-          <w:rFonts w:eastAsia="Arial Unicode MS" w:ascii="Arial Unicode MS" w:hAnsi="Arial Unicode MS"/>
-        </w:rPr>
-        <w:br/>
-      </w:r>
-      <w:r>
-        <w:rPr>
-          <w:rFonts w:eastAsia="Arial Unicode MS" w:ascii="Arial Unicode MS" w:hAnsi="Arial Unicode MS"/>
-        </w:rPr>
-        <w:t>列出需要我人工打开、取得权限或确认版本的项目。</w:t>
+        <w:t>请逐条核对 manifest.csv 与实际文件，找出缺文件、缺记录、重复文件及 verify_failed 项目，不删除或覆盖。生成检查报告，分别统计原始输入、唯一文献、已处理和未处理数；downloaded_verified 与 fulltext_other 分开。列出需人工打开、取得权限或确认版本的项目。</w:t>
       </w:r>
       <w:r>
         <w:rPr>
@@ -3250,7 +2933,7 @@
         <w:rPr>
           <w:rFonts w:eastAsia="Arial Unicode MS" w:ascii="Arial Unicode MS" w:hAnsi="Arial Unicode MS"/>
         </w:rPr>
-        <w:t>11 卡住了 按失败位置继续处理</w:t>
+        <w:t>11 按失败环节排查，再续做</w:t>
       </w:r>
     </w:p>
     <w:p>
@@ -3265,8 +2948,8 @@
         </w:rPr>
         <w:drawing>
           <wp:inline xmlns:a="http://schemas.openxmlformats.org/drawingml/2006/main" xmlns:pic="http://schemas.openxmlformats.org/drawingml/2006/picture">
-            <wp:extent cx="2663300" cy="4663438"/>
-            <wp:docPr id="13" name="Picture 13" descr="图12 常见问题的排查顺序"/>
+            <wp:extent cx="2402193" cy="4206240"/>
+            <wp:docPr id="17" name="Picture 17" descr="图16 排错顺序"/>
             <wp:cNvGraphicFramePr>
               <a:graphicFrameLocks noChangeAspect="1"/>
             </wp:cNvGraphicFramePr>
@@ -3278,7 +2961,7 @@
                     <pic:cNvPicPr/>
                   </pic:nvPicPr>
                   <pic:blipFill>
-                    <a:blip r:embed="rId35"/>
+                    <a:blip r:embed="rId38"/>
                     <a:stretch>
                       <a:fillRect/>
                     </a:stretch>
@@ -3286,7 +2969,7 @@
                   <pic:spPr>
                     <a:xfrm>
                       <a:off x="0" y="0"/>
-                      <a:ext cx="2663300" cy="4663438"/>
+                      <a:ext cx="2402193" cy="4206240"/>
                     </a:xfrm>
                     <a:prstGeom prst="rect"/>
                   </pic:spPr>
@@ -3305,129 +2988,7 @@
         <w:rPr>
           <w:rFonts w:eastAsia="Arial Unicode MS" w:ascii="Arial Unicode MS" w:hAnsi="Arial Unicode MS"/>
         </w:rPr>
-        <w:t>图12｜排错指令卡。找到失败环节后，处理对应问题，再继续未完成项。</w:t>
-      </w:r>
-    </w:p>
-    <w:p>
-      <w:pPr/>
-      <w:r>
-        <w:rPr>
-          <w:rFonts w:eastAsia="Arial Unicode MS" w:ascii="Arial Unicode MS" w:hAnsi="Arial Unicode MS"/>
-          <w:b/>
-        </w:rPr>
-        <w:t>Hermes 命令无法运行。</w:t>
-      </w:r>
-      <w:r>
-        <w:rPr>
-          <w:rFonts w:eastAsia="Arial Unicode MS" w:ascii="Arial Unicode MS" w:hAnsi="Arial Unicode MS"/>
-        </w:rPr>
-        <w:t xml:space="preserve"> 回到安装步骤，重开终端后执行 </w:t>
-      </w:r>
-      <w:r>
-        <w:rPr>
-          <w:rFonts w:ascii="Menlo" w:hAnsi="Menlo" w:eastAsia="Arial Unicode MS"/>
-          <w:sz w:val="18"/>
-        </w:rPr>
-        <w:t>hermes --help</w:t>
-      </w:r>
-      <w:r>
-        <w:rPr>
-          <w:rFonts w:eastAsia="Arial Unicode MS" w:ascii="Arial Unicode MS" w:hAnsi="Arial Unicode MS"/>
-        </w:rPr>
-        <w:t>。如果依旧失败，查看官方安装指南中的 PATH 和安装位置说明。</w:t>
-      </w:r>
-    </w:p>
-    <w:p>
-      <w:pPr/>
-      <w:r>
-        <w:rPr>
-          <w:rFonts w:eastAsia="Arial Unicode MS" w:ascii="Arial Unicode MS" w:hAnsi="Arial Unicode MS"/>
-          <w:b/>
-        </w:rPr>
-        <w:t>模型能回答，但任务没执行。</w:t>
-      </w:r>
-      <w:r>
-        <w:rPr>
-          <w:rFonts w:eastAsia="Arial Unicode MS" w:ascii="Arial Unicode MS" w:hAnsi="Arial Unicode MS"/>
-        </w:rPr>
-        <w:t xml:space="preserve"> 检查当前 CLI 平台的工具是否启用，用环境检查提示词验证实际调用。安装成功和模型能聊天，是两项不同的检查。</w:t>
-      </w:r>
-    </w:p>
-    <w:p>
-      <w:pPr/>
-      <w:r>
-        <w:rPr>
-          <w:rFonts w:eastAsia="Arial Unicode MS" w:ascii="Arial Unicode MS" w:hAnsi="Arial Unicode MS"/>
-          <w:b/>
-        </w:rPr>
-        <w:t>搜索有结果，提取失败。</w:t>
-      </w:r>
-      <w:r>
-        <w:rPr>
-          <w:rFonts w:eastAsia="Arial Unicode MS" w:ascii="Arial Unicode MS" w:hAnsi="Arial Unicode MS"/>
-        </w:rPr>
-        <w:t xml:space="preserve"> 查看网页服务是否只支持搜索，回到 </w:t>
-      </w:r>
-      <w:r>
-        <w:rPr>
-          <w:rFonts w:ascii="Menlo" w:hAnsi="Menlo" w:eastAsia="Arial Unicode MS"/>
-          <w:sz w:val="18"/>
-        </w:rPr>
-        <w:t>hermes tools</w:t>
-      </w:r>
-      <w:r>
-        <w:rPr>
-          <w:rFonts w:eastAsia="Arial Unicode MS" w:ascii="Arial Unicode MS" w:hAnsi="Arial Unicode MS"/>
-        </w:rPr>
-        <w:t xml:space="preserve"> 配置提取能力。需要点击页面的任务，再配置浏览器。抓到的网页文字与磁盘上的 PDF，分别验收。</w:t>
-      </w:r>
-    </w:p>
-    <w:p>
-      <w:pPr/>
-      <w:r>
-        <w:rPr>
-          <w:rFonts w:eastAsia="Arial Unicode MS" w:ascii="Arial Unicode MS" w:hAnsi="Arial Unicode MS"/>
-          <w:b/>
-        </w:rPr>
-        <w:t>返回 401、403 或 429。</w:t>
-      </w:r>
-      <w:r>
-        <w:rPr>
-          <w:rFonts w:eastAsia="Arial Unicode MS" w:ascii="Arial Unicode MS" w:hAnsi="Arial Unicode MS"/>
-        </w:rPr>
-        <w:t xml:space="preserve"> 401 通常需要检查认证；403 需要核对访问权限、来源和服务配置；429 表示请求受到限流，按服务提示等待或缩小批量。不要重复无间隔请求。</w:t>
-      </w:r>
-    </w:p>
-    <w:p>
-      <w:pPr/>
-      <w:r>
-        <w:rPr>
-          <w:rFonts w:eastAsia="Arial Unicode MS" w:ascii="Arial Unicode MS" w:hAnsi="Arial Unicode MS"/>
-          <w:b/>
-        </w:rPr>
-        <w:t>说已保存，但电脑里找不到。</w:t>
-      </w:r>
-      <w:r>
-        <w:rPr>
-          <w:rFonts w:eastAsia="Arial Unicode MS" w:ascii="Arial Unicode MS" w:hAnsi="Arial Unicode MS"/>
-        </w:rPr>
-        <w:t xml:space="preserve"> 要求它通过终端重新列出文件，返回绝对路径和运行后端。本机、容器、远程服务器中的同名路径可能是不同位置；远程运行需要按环境取回文件。</w:t>
-      </w:r>
-    </w:p>
-    <w:p>
-      <w:pPr/>
-      <w:r>
-        <w:rPr>
-          <w:rFonts w:eastAsia="Arial Unicode MS" w:ascii="Arial Unicode MS" w:hAnsi="Arial Unicode MS"/>
-          <w:b/>
-        </w:rPr>
-        <w:t>PDF 打不开或内容不对。</w:t>
-      </w:r>
-      <w:r>
-        <w:rPr>
-          <w:rFonts w:eastAsia="Arial Unicode MS" w:ascii="Arial Unicode MS" w:hAnsi="Arial Unicode MS"/>
-        </w:rPr>
-        <w:t xml:space="preserve"> 将状态改为 verify_failed，重新核对题录与真实下载入口。不要用重新命名扩展名的方式“修复”。</w:t>
+        <w:t>图16｜排错指令卡，非软件截图。先找失败环节，再处理未完成项。</w:t>
       </w:r>
     </w:p>
     <w:p>
@@ -3436,16 +2997,17 @@
         <w:rPr>
           <w:rFonts w:eastAsia="Arial Unicode MS" w:ascii="Arial Unicode MS" w:hAnsi="Arial Unicode MS"/>
         </w:rPr>
-        <w:t>需要检查 Hermes 配置状态时，可以退出对话，或另开一个电脑终端，运行以下诊断命令。先读报告，再处理具体问题。</w:t>
+        <w:t>命令打不开查安装与 PATH；能聊天不执行查当前平台工具；能搜索不提取查服务能力；说已保存却找不到，重新列绝对路径与后端。401 核对认证，403 核对权限和来源，429 按提示等待或缩小批量；PDF 内容不对标记 verify_failed。</w:t>
       </w:r>
-      <w:hyperlink r:id="rId36">
-        <w:r>
-          <w:rPr>
-            <w:color w:val="197B82"/>
-          </w:rPr>
-          <w:t>CLI 诊断命令说明</w:t>
-        </w:r>
-      </w:hyperlink>
+    </w:p>
+    <w:p>
+      <w:pPr/>
+      <w:r>
+        <w:rPr>
+          <w:rFonts w:eastAsia="Arial Unicode MS" w:ascii="Arial Unicode MS" w:hAnsi="Arial Unicode MS"/>
+        </w:rPr>
+        <w:t>另开电脑终端检查状态：</w:t>
+      </w:r>
     </w:p>
     <w:p>
       <w:pPr>
@@ -3468,7 +3030,7 @@
         <w:rPr>
           <w:rFonts w:eastAsia="Arial Unicode MS" w:ascii="Arial Unicode MS" w:hAnsi="Arial Unicode MS"/>
         </w:rPr>
-        <w:t xml:space="preserve">任务中断后，可以用 </w:t>
+        <w:t xml:space="preserve">用 </w:t>
       </w:r>
       <w:r>
         <w:rPr>
@@ -3481,25 +3043,41 @@
         <w:rPr>
           <w:rFonts w:eastAsia="Arial Unicode MS" w:ascii="Arial Unicode MS" w:hAnsi="Arial Unicode MS"/>
         </w:rPr>
-        <w:t xml:space="preserve"> 恢复最近会话。恢复对话只会恢复已有会话上下文；接着依据磁盘清单续做，才容易避免重复下载。</w:t>
+        <w:t xml:space="preserve"> 可恢复最近会话，继续任务仍要依据磁盘清单。</w:t>
       </w:r>
-      <w:hyperlink r:id="rId37">
+      <w:hyperlink r:id="rId39">
         <w:r>
           <w:rPr>
             <w:color w:val="197B82"/>
           </w:rPr>
-          <w:t>会话恢复说明</w:t>
+          <w:t>诊断命令</w:t>
+        </w:r>
+      </w:hyperlink>
+      <w:r>
+        <w:rPr>
+          <w:rFonts w:eastAsia="Arial Unicode MS" w:ascii="Arial Unicode MS" w:hAnsi="Arial Unicode MS"/>
+        </w:rPr>
+        <w:t>、</w:t>
+      </w:r>
+      <w:hyperlink r:id="rId40">
+        <w:r>
+          <w:rPr>
+            <w:color w:val="197B82"/>
+          </w:rPr>
+          <w:t>恢复说明</w:t>
         </w:r>
       </w:hyperlink>
     </w:p>
     <w:p>
-      <w:pPr/>
+      <w:pPr>
+        <w:keepNext/>
+      </w:pPr>
       <w:r>
         <w:rPr>
           <w:rFonts w:eastAsia="Arial Unicode MS" w:ascii="Arial Unicode MS" w:hAnsi="Arial Unicode MS"/>
           <w:b/>
         </w:rPr>
-        <w:t>复制给 Hermes：</w:t>
+        <w:t>续做提示词：</w:t>
       </w:r>
     </w:p>
     <w:p>
@@ -3519,8 +3097,34 @@
         <w:rPr>
           <w:rFonts w:eastAsia="Arial Unicode MS" w:ascii="Arial Unicode MS" w:hAnsi="Arial Unicode MS"/>
         </w:rPr>
-        <w:t>请读取现有 manifest.csv 和实际文件。先核验 downloaded_verified 项目是否仍存在，不重复下载。</w:t>
+        <w:t>请读取现有 manifest.csv 和文件，核对 downloaded_verified 项目仍在，不重复下载。列出待办，只继续我指定的 download_failed 和 not_found；verify_failed 先排查，needs_access 留为人工待办。保留已有文件和记录，追加本次时间、来源及结果并更新状态。</w:t>
       </w:r>
+      <w:r>
+        <w:rPr>
+          <w:rFonts w:eastAsia="Arial Unicode MS" w:ascii="Arial Unicode MS" w:hAnsi="Arial Unicode MS"/>
+        </w:rPr>
+        <w:br/>
+      </w:r>
+    </w:p>
+    <w:p>
+      <w:pPr>
+        <w:keepNext/>
+      </w:pPr>
+      <w:r>
+        <w:rPr>
+          <w:rFonts w:eastAsia="Arial Unicode MS" w:ascii="Arial Unicode MS" w:hAnsi="Arial Unicode MS"/>
+          <w:b/>
+        </w:rPr>
+        <w:t>需要报错帮助时：</w:t>
+      </w:r>
+    </w:p>
+    <w:p>
+      <w:pPr>
+        <w:pStyle w:val="HermesPrompt"/>
+        <w:keepLines/>
+        <w:shd w:fill="EDF7F3"/>
+        <w:ind w:left="173" w:right="173"/>
+      </w:pPr>
       <w:r>
         <w:rPr>
           <w:rFonts w:eastAsia="Arial Unicode MS" w:ascii="Arial Unicode MS" w:hAnsi="Arial Unicode MS"/>
@@ -3531,19 +3135,7 @@
         <w:rPr>
           <w:rFonts w:eastAsia="Arial Unicode MS" w:ascii="Arial Unicode MS" w:hAnsi="Arial Unicode MS"/>
         </w:rPr>
-        <w:t>列出待处理项目，只继续我指定的 download_failed 和 not_found 项目。verify_failed 项目先排查原因；needs_access 项目列为人工待办。</w:t>
-      </w:r>
-      <w:r>
-        <w:rPr>
-          <w:rFonts w:eastAsia="Arial Unicode MS" w:ascii="Arial Unicode MS" w:hAnsi="Arial Unicode MS"/>
-        </w:rPr>
-        <w:br/>
-      </w:r>
-      <w:r>
-        <w:rPr>
-          <w:rFonts w:eastAsia="Arial Unicode MS" w:ascii="Arial Unicode MS" w:hAnsi="Arial Unicode MS"/>
-        </w:rPr>
-        <w:t>保留原记录和既有文件，追加本次尝试时间、来源与结果，并更新状态。</w:t>
+        <w:t>任务停在〔阶段〕，实际错误为〔摘要〕，工具为〔名称〕，文献编号为〔编号〕，目录为〔路径〕。请先检查失败环节，区分已确认原因与待验证项，给出下一步最小操作；暂不扩展批量。以上内容已遮去密钥与登录令牌。</w:t>
       </w:r>
       <w:r>
         <w:rPr>
@@ -3560,7 +3152,7 @@
         <w:rPr>
           <w:rFonts w:eastAsia="Arial Unicode MS" w:ascii="Arial Unicode MS" w:hAnsi="Arial Unicode MS"/>
         </w:rPr>
-        <w:t>12 今天就从一篇论文开始</w:t>
+        <w:t>12 跑通一篇，再带入自己的课题</w:t>
       </w:r>
     </w:p>
     <w:p>
@@ -3569,16 +3161,20 @@
         <w:rPr>
           <w:rFonts w:eastAsia="Arial Unicode MS" w:ascii="Arial Unicode MS" w:hAnsi="Arial Unicode MS"/>
         </w:rPr>
-        <w:t>如果你第一次使用 Hermes，按这条顺序就可以开始：安装并打开命令帮助；完成模型、工具和文件测试；获取 arXiv:1706.03762；自己打开 PDF；核对清单，再做三行 CSV 的去重练习。</w:t>
+        <w:t>第一次只需完成：</w:t>
       </w:r>
-    </w:p>
-    <w:p>
-      <w:pPr/>
+      <w:r>
+        <w:rPr>
+          <w:rFonts w:eastAsia="Arial Unicode MS" w:ascii="Arial Unicode MS" w:hAnsi="Arial Unicode MS"/>
+          <w:b/>
+        </w:rPr>
+        <w:t>命令可用、工具实际执行、全文能打开、清单可对应。</w:t>
+      </w:r>
       <w:r>
         <w:rPr>
           <w:rFonts w:eastAsia="Arial Unicode MS" w:ascii="Arial Unicode MS" w:hAnsi="Arial Unicode MS"/>
         </w:rPr>
-        <w:t>等这一轮稳定完成，再把自己的课题文献带进去。持续保留来源、版本和失败原因，后续补全文、整理引用和重新核查都会更方便。</w:t>
+        <w:t xml:space="preserve"> 再用三条 CSV 记录练习去重，最后换成自己的课题。来源、版本和失败原因保留完整，后续补全文和整理引用更方便。</w:t>
       </w:r>
     </w:p>
     <w:p>
@@ -3589,7 +3185,7 @@
         <w:rPr>
           <w:rFonts w:eastAsia="Arial Unicode MS" w:ascii="Arial Unicode MS" w:hAnsi="Arial Unicode MS"/>
         </w:rPr>
-        <w:t>核验说明：命令与功能依据官方文档核对；图5使用匿名访问 arXiv 公开页面取得的真实局部截图，其余操作图为指令卡或流程图。本文没有将提示词模板表述为已运行的 Hermes 下载实测，执行结果需在读者环境中验收。</w:t>
+        <w:t>核验说明：命令与功能依据官方文档核对；图8为真实页面局部截图，其余为指令卡或流程图。本教程未在本机执行 Hermes 论文下载，任务模板的结果需在读者环境验收。</w:t>
       </w:r>
     </w:p>
     <w:p>
@@ -3600,10 +3196,11 @@
         <w:rPr>
           <w:rFonts w:eastAsia="Arial Unicode MS" w:ascii="Arial Unicode MS" w:hAnsi="Arial Unicode MS"/>
         </w:rPr>
-        <w:t>全文获取和后续分享按来源的访问权限与使用条款处理。公众号文章可以分享获取方法和题录链接，转发论文原文前还应核对该文件的许可。</w:t>
+        <w:t>发表与分享：文章可以分享获取方法和题录链接；转发论文原文前核对许可。公众号导入、补图和手机预览步骤见配套发表指南。</w:t>
       </w:r>
     </w:p>
     <w:sectPr>
+      <w:footerReference w:type="default" r:id="rId41"/>
       <w:pgSz w:w="11909" w:h="16834"/>
       <w:pgMar w:top="1008" w:right="1080" w:bottom="1008" w:left="1080" w:header="720" w:footer="720" w:gutter="0"/>
       <w:cols w:space="720"/>
@@ -3611,6 +3208,33 @@
     </w:sectPr>
   </w:body>
 </w:document>
+</file>
+
+<file path=word/footer1.xml><?xml version="1.0" encoding="utf-8"?>
+<w:ftr xmlns:m="http://schemas.openxmlformats.org/officeDocument/2006/math" xmlns:mc="http://schemas.openxmlformats.org/markup-compatibility/2006" xmlns:mo="http://schemas.microsoft.com/office/mac/office/2008/main" xmlns:mv="urn:schemas-microsoft-com:mac:vml" xmlns:o="urn:schemas-microsoft-com:office:office" xmlns:r="http://schemas.openxmlformats.org/officeDocument/2006/relationships" xmlns:v="urn:schemas-microsoft-com:vml" xmlns:w10="urn:schemas-microsoft-com:office:word" xmlns:w14="http://schemas.microsoft.com/office/word/2010/wordml" xmlns:w="http://schemas.openxmlformats.org/wordprocessingml/2006/main" xmlns:wne="http://schemas.microsoft.com/office/word/2006/wordml" xmlns:wp14="http://schemas.microsoft.com/office/word/2010/wordprocessingDrawing" xmlns:wp="http://schemas.openxmlformats.org/drawingml/2006/wordprocessingDrawing" xmlns:wpc="http://schemas.microsoft.com/office/word/2010/wordprocessingCanvas" xmlns:wpg="http://schemas.microsoft.com/office/word/2010/wordprocessingGroup" xmlns:wpi="http://schemas.microsoft.com/office/word/2010/wordprocessingInk" xmlns:wps="http://schemas.microsoft.com/office/word/2010/wordprocessingShape" mc:Ignorable="w14 wp14">
+  <w:p>
+    <w:pPr>
+      <w:pStyle w:val="Footer"/>
+      <w:jc w:val="center"/>
+    </w:pPr>
+    <w:r>
+      <w:rPr>
+        <w:color w:val="617A83"/>
+        <w:sz w:val="16"/>
+      </w:rPr>
+      <w:t xml:space="preserve">Hermes Agent 文献下载图文教程  </w:t>
+    </w:r>
+    <w:fldSimple w:instr="PAGE"/>
+    <w:r>
+      <w:rPr>
+        <w:color w:val="617A83"/>
+        <w:sz w:val="16"/>
+      </w:rPr>
+      <w:t xml:space="preserve"> / </w:t>
+    </w:r>
+    <w:fldSimple w:instr="NUMPAGES"/>
+  </w:p>
+</w:ftr>
 </file>
 
 <file path=word/numbering.xml><?xml version="1.0" encoding="utf-8"?>
@@ -3977,7 +3601,7 @@
     <w:qFormat/>
     <w:rsid w:val="00FC693F"/>
     <w:pPr>
-      <w:spacing w:line="360" w:lineRule="auto" w:after="140"/>
+      <w:spacing w:line="317" w:lineRule="auto" w:after="120"/>
     </w:pPr>
     <w:rPr>
       <w:rFonts w:ascii="Arial Unicode MS" w:hAnsi="Arial Unicode MS" w:eastAsia="Arial Unicode MS"/>

</xml_diff>